<commit_message>
Mise à jour documentation après déploiement en production
L'application Reminder Famille est désormais déployée :
- Front : https://reminder-famille.vercel.app (Vercel + CDN global)
- Back  : https://reminder-famille-back.fly.dev (Fly.io région cdg/Paris)

Modifications :
- dossier-projet.md section 13 'Déploiement' : remplacement du plan
  prévisionnel par la description de l'architecture réellement déployée
  (Dockerfile, fly.toml, vercel.json effectifs, secrets via fly secrets)
- README + dossier-projet/README : ajout des URLs de production et
  comptes démo accessibles en ligne
- DP.md : projet professionnel ajusté (maintenance d'une app déployée
  plutôt que déploiement à venir)
- slides.md : compromis et conclusion remis à jour avec URL live
- DP_AFPA_rempli.docx + fill_dp_template.py : URL prod ajoutée aux
  informations complémentaires des AT1/AT2
- Régénération de tous les PDFs et slides binaires
</commit_message>
<xml_diff>
--- a/dossier-professionnel/DP_AFPA_rempli.docx
+++ b/dossier-professionnel/DP_AFPA_rempli.docx
@@ -5585,7 +5585,25 @@
           </w:tcPr>
           <w:p>
             <w:r>
-              <w:t xml:space="preserve">Code source public sous licence MIT : </w:t>
+              <w:t xml:space="preserve">Application déployée en ligne :</w:t>
+            </w:r>
+            <w:r>
+              <w:br/>
+            </w:r>
+            <w:r>
+              <w:t xml:space="preserve">https://reminder-famille.vercel.app</w:t>
+            </w:r>
+            <w:r>
+              <w:br/>
+            </w:r>
+            <w:r>
+              <w:t xml:space="preserve"/>
+            </w:r>
+            <w:r>
+              <w:br/>
+            </w:r>
+            <w:r>
+              <w:t xml:space="preserve">Code source public sous licence MIT :</w:t>
             </w:r>
             <w:r>
               <w:br/>
@@ -7134,7 +7152,25 @@
           </w:tcPr>
           <w:p>
             <w:r>
-              <w:t xml:space="preserve">Code source public sous licence MIT : </w:t>
+              <w:t xml:space="preserve">Application déployée en ligne :</w:t>
+            </w:r>
+            <w:r>
+              <w:br/>
+            </w:r>
+            <w:r>
+              <w:t xml:space="preserve">https://reminder-famille.vercel.app</w:t>
+            </w:r>
+            <w:r>
+              <w:br/>
+            </w:r>
+            <w:r>
+              <w:t xml:space="preserve"/>
+            </w:r>
+            <w:r>
+              <w:br/>
+            </w:r>
+            <w:r>
+              <w:t xml:space="preserve">Code source public sous licence MIT :</w:t>
             </w:r>
             <w:r>
               <w:br/>

</xml_diff>

<commit_message>
DP — régénération du blanc officiel AFPA (docx + pdf)
Le fichier officiel AFPA DP_AFPA_rempli.docx datait du 2 juin et
contenait encore les références au projet Reminder Famille, l'ancien
intitulé INSEEC (« Université française »), l'âge 43 ans et le bullet
sur la recherche d'alternance.

Régénéré depuis fill_dp_template.py qui a été mis à jour précédemment :
- Crew remplace Reminder Famille (9 mentions confirmées)
- INSEEC — École de commerce, Paris (1 mention diplôme)
- Plus aucune mention résiduelle de « Reminder » ou « reminder-famille »
- URLs et code source pointent vers le dépôt crew

PDF rerendu via libreoffice --convert-to pdf à partir du docx
régénéré. Note : DP.pdf (rendu Markdown) reste sur l'ancienne version
du 2 juin — la régénération nécessite pandoc qui n'est pas installé
sur la machine ; à régénérer manuellement avant la soutenance.
</commit_message>
<xml_diff>
--- a/dossier-professionnel/DP_AFPA_rempli.docx
+++ b/dossier-professionnel/DP_AFPA_rempli.docx
@@ -2022,7 +2022,7 @@
           </w:tcPr>
           <w:p>
             <w:r>
-              <w:t xml:space="preserve">Application Reminder Famille — front-end React 18 complet</w:t>
+              <w:t xml:space="preserve">Application Crew — planification d'équipe React 18 complète</w:t>
             </w:r>
           </w:p>
         </w:tc>
@@ -2446,7 +2446,7 @@
           </w:tcPr>
           <w:p>
             <w:r>
-              <w:t xml:space="preserve">Application Reminder Famille — API Node.js/Express sécurisée</w:t>
+              <w:t xml:space="preserve">Application Crew — API Node.js/Express sécurisée</w:t>
             </w:r>
           </w:p>
         </w:tc>
@@ -4524,7 +4524,7 @@
                   <w:rPr>
                     <w:b/>
                   </w:rPr>
-                  <w:t xml:space="preserve">Application Reminder Famille — front-end React 18 complet</w:t>
+                  <w:t xml:space="preserve">Application Crew — planification d'équipe React 18 complète</w:t>
                 </w:r>
               </w:p>
             </w:tc>
@@ -4628,7 +4628,7 @@
           </w:tcPr>
           <w:p>
             <w:r>
-              <w:t xml:space="preserve">Dans le cadre du projet de fin de formation Reminder Famille (gestion de tâches familiales avec rôles parent/enfant), j'ai réalisé l'intégralité de la partie front-end de l'application. J'ai notamment :</w:t>
+              <w:t xml:space="preserve">Dans le cadre du projet de fin de formation Crew (gestion de tâches familiales avec rôles parent/enfant), j'ai réalisé l'intégralité de la partie front-end de l'application. J'ai notamment :</w:t>
             </w:r>
             <w:r>
               <w:br/>
@@ -5389,7 +5389,7 @@
               </w:tcPr>
               <w:p>
                 <w:r>
-                  <w:t xml:space="preserve">AFPA Marseille — projet de fin de formation « Reminder Famille »</w:t>
+                  <w:t xml:space="preserve">AFPA Marseille — projet de fin de formation « Crew »</w:t>
                 </w:r>
               </w:p>
             </w:tc>
@@ -5591,7 +5591,7 @@
               <w:br/>
             </w:r>
             <w:r>
-              <w:t xml:space="preserve">https://reminder-famille.vercel.app</w:t>
+              <w:t xml:space="preserve">https://crew-planner-hazel.vercel.app</w:t>
             </w:r>
             <w:r>
               <w:br/>
@@ -5609,7 +5609,7 @@
               <w:br/>
             </w:r>
             <w:r>
-              <w:t xml:space="preserve">https://github.com/Vladimir08880888/reminder-famille</w:t>
+              <w:t xml:space="preserve">https://github.com/Vladimir08880888/crew</w:t>
             </w:r>
             <w:r>
               <w:br/>
@@ -6007,7 +6007,7 @@
                   <w:rPr>
                     <w:b/>
                   </w:rPr>
-                  <w:t xml:space="preserve">Application Reminder Famille — API Node.js/Express sécurisée</w:t>
+                  <w:t xml:space="preserve">Application Crew — API Node.js/Express sécurisée</w:t>
                 </w:r>
               </w:p>
             </w:tc>
@@ -6111,7 +6111,7 @@
           </w:tcPr>
           <w:p>
             <w:r>
-              <w:t xml:space="preserve">Pour le même projet Reminder Famille, j'ai conçu et développé l'intégralité de la partie back-end : conception de la base de données, API REST sécurisée, et logique métier de l'application multi-utilisateurs.</w:t>
+              <w:t xml:space="preserve">Pour le même projet Crew, j'ai conçu et développé l'intégralité de la partie back-end : conception de la base de données, API REST sécurisée, et logique métier de l'application multi-utilisateurs.</w:t>
             </w:r>
             <w:r>
               <w:br/>
@@ -6956,7 +6956,7 @@
               </w:tcPr>
               <w:p>
                 <w:r>
-                  <w:t xml:space="preserve">AFPA Marseille — projet de fin de formation « Reminder Famille »</w:t>
+                  <w:t xml:space="preserve">AFPA Marseille — projet de fin de formation « Crew »</w:t>
                 </w:r>
               </w:p>
             </w:tc>
@@ -7158,7 +7158,7 @@
               <w:br/>
             </w:r>
             <w:r>
-              <w:t xml:space="preserve">https://reminder-famille.vercel.app</w:t>
+              <w:t xml:space="preserve">https://crew-planner-hazel.vercel.app</w:t>
             </w:r>
             <w:r>
               <w:br/>
@@ -7176,7 +7176,7 @@
               <w:br/>
             </w:r>
             <w:r>
-              <w:t xml:space="preserve">https://github.com/Vladimir08880888/reminder-famille</w:t>
+              <w:t xml:space="preserve">https://github.com/Vladimir08880888/crew</w:t>
             </w:r>
             <w:r>
               <w:br/>
@@ -7722,7 +7722,7 @@
           </w:tcPr>
           <w:p>
             <w:r>
-              <w:t xml:space="preserve">Université française</w:t>
+              <w:t xml:space="preserve">INSEEC — École de commerce, Paris</w:t>
             </w:r>
           </w:p>
         </w:tc>
@@ -9392,7 +9392,7 @@
           </w:tcPr>
           <w:p>
             <w:r>
-              <w:t xml:space="preserve">Code source du projet Reminder Famille — github.com/Vladimir08880888/reminder-famille</w:t>
+              <w:t xml:space="preserve">Code source du projet Crew — github.com/Vladimir08880888/crew</w:t>
             </w:r>
           </w:p>
         </w:tc>
@@ -9496,7 +9496,7 @@
           </w:tcPr>
           <w:p>
             <w:r>
-              <w:t xml:space="preserve">Documentation API REST (30+ endpoints) — dossier-projet/api-documentation.pdf</w:t>
+              <w:t xml:space="preserve">Cahier des charges (sections 1-11, évolutions v2) — dossier-projet/cahier-des-charges.md</w:t>
             </w:r>
           </w:p>
         </w:tc>
@@ -9518,7 +9518,7 @@
           </w:tcPr>
           <w:p>
             <w:r>
-              <w:t xml:space="preserve">Document Sécurité OWASP — dossier-projet/securite.pdf</w:t>
+              <w:t xml:space="preserve">Justification scientifique (12 références peer-reviewed) — dossier-projet/annexes/JUSTIFICATION_SCIENTIFIQUE.md</w:t>
             </w:r>
           </w:p>
         </w:tc>
@@ -9540,7 +9540,7 @@
           </w:tcPr>
           <w:p>
             <w:r>
-              <w:t xml:space="preserve">Charte graphique + Wireframes — dossier-projet/maquettes/</w:t>
+              <w:t xml:space="preserve">Schéma BDD (Mermaid ERD) — dossier-projet/annexes/SCHEMA_BDD.md</w:t>
             </w:r>
           </w:p>
         </w:tc>
@@ -9562,7 +9562,7 @@
           </w:tcPr>
           <w:p>
             <w:r>
-              <w:t xml:space="preserve">8 diagrammes UML/Merise (Mermaid) — dossier-projet/diagrammes/</w:t>
+              <w:t xml:space="preserve">Manuel utilisateur (manager + équipier) — dossier-projet/annexes/MANUEL_UTILISATEUR.md</w:t>
             </w:r>
           </w:p>
         </w:tc>
@@ -9584,7 +9584,7 @@
           </w:tcPr>
           <w:p>
             <w:r>
-              <w:t xml:space="preserve">17 captures d'écran haute résolution — reminder-famille/annexes/screenshots/</w:t>
+              <w:t xml:space="preserve">17 captures d'écran haute résolution — dossier-projet/annexes/screenshots/</w:t>
             </w:r>
           </w:p>
         </w:tc>
@@ -9606,7 +9606,7 @@
           </w:tcPr>
           <w:p>
             <w:r>
-              <w:t xml:space="preserve">Suite de 57 tests d'intégration (100 % PASS) — reminder-famille/tests/integration.sh</w:t>
+              <w:t xml:space="preserve">Plan de tests (60+ scénarios Playwright) — dossier-projet/annexes/PLAN_DE_TESTS.md</w:t>
             </w:r>
           </w:p>
         </w:tc>
@@ -9628,7 +9628,7 @@
           </w:tcPr>
           <w:p>
             <w:r>
-              <w:t xml:space="preserve">Slides de soutenance (PDF + HTML + PPTX) — dossier-projet/slides.*</w:t>
+              <w:t xml:space="preserve">Trame de soutenance — dossier-projet/soutenance.md</w:t>
             </w:r>
           </w:p>
         </w:tc>

</xml_diff>

<commit_message>
Fix DP — première page : nom/prénom/adresse en ligne (pas en colonne)
Le tableau d'identité du blanc AFPA a 3 colonnes :
  - col 0 : libellé (4 cm)
  - col 1 : icône séparateur (0,4 cm — wingding)
  - col 2 : zone de saisie (9 cm — contenait le placeholder
            « Entrez votre nom ici »)

Le script écrivait la valeur dans col 1 (la cellule 0,4 cm), ce qui
forçait LibreOffice/Word à wrapper chaque caractère sur une nouvelle
ligne (texte rendu verticalement : R / O / D / Z / A...). La col 2,
elle, était vidée alors qu'elle est faite pour recevoir la valeur.

Correction : écrire la valeur dans tcs[2] et laisser tcs[1] (l'icône
séparatrice) intacte. Le texte s'affiche maintenant horizontalement
sur une seule ligne dans la zone large.

PDF régénéré via libreoffice --convert-to pdf.
</commit_message>
<xml_diff>
--- a/dossier-professionnel/DP_AFPA_rempli.docx
+++ b/dossier-professionnel/DP_AFPA_rempli.docx
@@ -131,8 +131,27 @@
             <w:vAlign w:val="center"/>
           </w:tcPr>
           <w:p>
-            <w:r>
-              <w:t xml:space="preserve">RODZAEVSKIY</w:t>
+            <w:pPr>
+              <w:ind w:left="-42"/>
+              <w:rPr>
+                <w:rFonts w:ascii="Wingdings 3" w:hAnsi="Wingdings 3" w:cstheme="minorHAnsi"/>
+                <w:noProof/>
+                <w:color w:val="D60093"/>
+                <w:sz w:val="12"/>
+                <w:szCs w:val="12"/>
+                <w:lang w:eastAsia="fr-FR"/>
+              </w:rPr>
+            </w:pPr>
+            <w:r>
+              <w:rPr>
+                <w:rFonts w:ascii="Wingdings 3" w:hAnsi="Wingdings 3" w:cstheme="minorHAnsi"/>
+                <w:noProof/>
+                <w:color w:val="D60093"/>
+                <w:sz w:val="12"/>
+                <w:szCs w:val="12"/>
+                <w:lang w:eastAsia="fr-FR"/>
+              </w:rPr>
+              <w:t></w:t>
             </w:r>
           </w:p>
         </w:tc>
@@ -160,7 +179,7 @@
               </w:tcPr>
               <w:p>
                 <w:r>
-                  <w:t xml:space="preserve"/>
+                  <w:t xml:space="preserve">RODZAEVSKIY</w:t>
                 </w:r>
               </w:p>
             </w:tc>
@@ -203,8 +222,27 @@
             <w:vAlign w:val="center"/>
           </w:tcPr>
           <w:p>
-            <w:r>
-              <w:t xml:space="preserve">RODZAEVSKIY</w:t>
+            <w:pPr>
+              <w:ind w:left="-42"/>
+              <w:rPr>
+                <w:rFonts w:cstheme="minorHAnsi"/>
+                <w:noProof/>
+                <w:color w:val="404040" w:themeColor="text1" w:themeTint="BF"/>
+                <w:sz w:val="12"/>
+                <w:szCs w:val="12"/>
+                <w:lang w:eastAsia="fr-FR"/>
+              </w:rPr>
+            </w:pPr>
+            <w:r>
+              <w:rPr>
+                <w:rFonts w:ascii="Wingdings 3" w:hAnsi="Wingdings 3" w:cstheme="minorHAnsi"/>
+                <w:noProof/>
+                <w:color w:val="D60093"/>
+                <w:sz w:val="12"/>
+                <w:szCs w:val="12"/>
+                <w:lang w:eastAsia="fr-FR"/>
+              </w:rPr>
+              <w:t></w:t>
             </w:r>
           </w:p>
         </w:tc>
@@ -232,7 +270,7 @@
               </w:tcPr>
               <w:p>
                 <w:r>
-                  <w:t xml:space="preserve"/>
+                  <w:t xml:space="preserve">RODZAEVSKIY</w:t>
                 </w:r>
               </w:p>
             </w:tc>
@@ -275,8 +313,27 @@
             <w:vAlign w:val="center"/>
           </w:tcPr>
           <w:p>
-            <w:r>
-              <w:t xml:space="preserve">Vladimir</w:t>
+            <w:pPr>
+              <w:ind w:left="-42"/>
+              <w:rPr>
+                <w:rFonts w:cstheme="minorHAnsi"/>
+                <w:noProof/>
+                <w:color w:val="404040" w:themeColor="text1" w:themeTint="BF"/>
+                <w:sz w:val="12"/>
+                <w:szCs w:val="12"/>
+                <w:lang w:eastAsia="fr-FR"/>
+              </w:rPr>
+            </w:pPr>
+            <w:r>
+              <w:rPr>
+                <w:rFonts w:ascii="Wingdings 3" w:hAnsi="Wingdings 3" w:cstheme="minorHAnsi"/>
+                <w:noProof/>
+                <w:color w:val="D60093"/>
+                <w:sz w:val="12"/>
+                <w:szCs w:val="12"/>
+                <w:lang w:eastAsia="fr-FR"/>
+              </w:rPr>
+              <w:t></w:t>
             </w:r>
           </w:p>
         </w:tc>
@@ -304,7 +361,7 @@
               </w:tcPr>
               <w:p>
                 <w:r>
-                  <w:t xml:space="preserve"/>
+                  <w:t xml:space="preserve">Vladimir</w:t>
                 </w:r>
               </w:p>
             </w:tc>
@@ -347,8 +404,27 @@
             <w:vAlign w:val="center"/>
           </w:tcPr>
           <w:p>
-            <w:r>
-              <w:t xml:space="preserve">58 avenue Maréchal Juin, 06400 Cannes</w:t>
+            <w:pPr>
+              <w:ind w:left="-42"/>
+              <w:rPr>
+                <w:rFonts w:cstheme="minorHAnsi"/>
+                <w:noProof/>
+                <w:color w:val="404040" w:themeColor="text1" w:themeTint="BF"/>
+                <w:sz w:val="12"/>
+                <w:szCs w:val="12"/>
+                <w:lang w:eastAsia="fr-FR"/>
+              </w:rPr>
+            </w:pPr>
+            <w:r>
+              <w:rPr>
+                <w:rFonts w:ascii="Wingdings 3" w:hAnsi="Wingdings 3" w:cstheme="minorHAnsi"/>
+                <w:noProof/>
+                <w:color w:val="D60093"/>
+                <w:sz w:val="12"/>
+                <w:szCs w:val="12"/>
+                <w:lang w:eastAsia="fr-FR"/>
+              </w:rPr>
+              <w:t></w:t>
             </w:r>
           </w:p>
         </w:tc>
@@ -376,7 +452,7 @@
               </w:tcPr>
               <w:p>
                 <w:r>
-                  <w:t xml:space="preserve"/>
+                  <w:t xml:space="preserve">58 avenue Maréchal Juin, 06400 Cannes</w:t>
                 </w:r>
               </w:p>
             </w:tc>

</xml_diff>

<commit_message>
DP — Sommaire avec numéros de page mesurés sur le PDF
La page 3 (Sommaire) avait des libellés mais aucun n° de page renseigné
(juste « p. ») — l'outil de navigation du jury n'était donc pas utilisable.

Numéros mesurés sur le PDF généré et écrits dans la dernière colonne
de chaque ligne du sommaire :
- AT1 (Développer la partie front-end) → p. 5
- AT2 (Développer la partie back-end)  → p. 8
- Titres / Diplômes                    → p. 11
- Déclaration sur l'honneur            → p. 12
- Documents illustrant                  → p. 13
- Annexes                              → p. 14

write_cell() accepte désormais un col_idx négatif pour cibler la
dernière colonne (le n° de page) indépendamment du nombre exact de
cellules dans la row (3 ou 4 selon le type de ligne du sommaire).

PDF régénéré.
</commit_message>
<xml_diff>
--- a/dossier-professionnel/DP_AFPA_rempli.docx
+++ b/dossier-professionnel/DP_AFPA_rempli.docx
@@ -2051,26 +2051,8 @@
             <w:vAlign w:val="center"/>
           </w:tcPr>
           <w:p>
-            <w:pPr>
-              <w:ind w:left="-109"/>
-              <w:jc w:val="right"/>
-              <w:rPr>
-                <w:rFonts w:cstheme="minorHAnsi"/>
-                <w:b/>
-                <w:color w:val="404040" w:themeColor="text1" w:themeTint="BF"/>
-                <w:sz w:val="24"/>
-                <w:szCs w:val="24"/>
-              </w:rPr>
-            </w:pPr>
-            <w:r>
-              <w:rPr>
-                <w:rFonts w:cstheme="minorHAnsi"/>
-                <w:b/>
-                <w:color w:val="404040" w:themeColor="text1" w:themeTint="BF"/>
-                <w:sz w:val="24"/>
-                <w:szCs w:val="24"/>
-              </w:rPr>
-              <w:t>5</w:t>
+            <w:r>
+              <w:t xml:space="preserve">5</w:t>
             </w:r>
           </w:p>
         </w:tc>
@@ -2144,19 +2126,9 @@
             <w:vAlign w:val="center"/>
           </w:tcPr>
           <w:p>
-            <w:pPr>
-              <w:tabs>
-                <w:tab w:val="left" w:pos="34"/>
-                <w:tab w:val="right" w:leader="dot" w:pos="9072"/>
-              </w:tabs>
-              <w:spacing w:before="120"/>
-              <w:ind w:left="-109"/>
-              <w:jc w:val="right"/>
-              <w:rPr>
-                <w:rFonts w:cstheme="minorHAnsi"/>
-                <w:color w:val="404040" w:themeColor="text1" w:themeTint="BF"/>
-              </w:rPr>
-            </w:pPr>
+            <w:r>
+              <w:t xml:space="preserve">5</w:t>
+            </w:r>
           </w:p>
         </w:tc>
       </w:tr>
@@ -2229,19 +2201,9 @@
             <w:vAlign w:val="center"/>
           </w:tcPr>
           <w:p>
-            <w:pPr>
-              <w:tabs>
-                <w:tab w:val="left" w:pos="34"/>
-                <w:tab w:val="right" w:leader="dot" w:pos="9072"/>
-              </w:tabs>
-              <w:spacing w:before="120"/>
-              <w:ind w:left="-109"/>
-              <w:jc w:val="right"/>
-              <w:rPr>
-                <w:rFonts w:cstheme="minorHAnsi"/>
-                <w:color w:val="404040" w:themeColor="text1" w:themeTint="BF"/>
-              </w:rPr>
-            </w:pPr>
+            <w:r>
+              <w:t xml:space="preserve">—</w:t>
+            </w:r>
           </w:p>
         </w:tc>
       </w:tr>
@@ -2314,19 +2276,9 @@
             <w:vAlign w:val="center"/>
           </w:tcPr>
           <w:p>
-            <w:pPr>
-              <w:tabs>
-                <w:tab w:val="left" w:pos="34"/>
-                <w:tab w:val="right" w:leader="dot" w:pos="9072"/>
-              </w:tabs>
-              <w:spacing w:before="120"/>
-              <w:ind w:left="-109"/>
-              <w:jc w:val="right"/>
-              <w:rPr>
-                <w:rFonts w:cstheme="minorHAnsi"/>
-                <w:color w:val="404040" w:themeColor="text1" w:themeTint="BF"/>
-              </w:rPr>
-            </w:pPr>
+            <w:r>
+              <w:t xml:space="preserve">—</w:t>
+            </w:r>
           </w:p>
         </w:tc>
       </w:tr>
@@ -2478,17 +2430,9 @@
             <w:vAlign w:val="center"/>
           </w:tcPr>
           <w:p>
-            <w:pPr>
-              <w:ind w:left="-109"/>
-              <w:jc w:val="right"/>
-              <w:rPr>
-                <w:rFonts w:cstheme="minorHAnsi"/>
-                <w:b/>
-                <w:color w:val="404040" w:themeColor="text1" w:themeTint="BF"/>
-                <w:sz w:val="24"/>
-                <w:szCs w:val="24"/>
-              </w:rPr>
-            </w:pPr>
+            <w:r>
+              <w:t xml:space="preserve">8</w:t>
+            </w:r>
           </w:p>
         </w:tc>
       </w:tr>
@@ -2568,19 +2512,9 @@
             <w:vAlign w:val="center"/>
           </w:tcPr>
           <w:p>
-            <w:pPr>
-              <w:tabs>
-                <w:tab w:val="left" w:pos="34"/>
-                <w:tab w:val="right" w:leader="dot" w:pos="9072"/>
-              </w:tabs>
-              <w:spacing w:before="120"/>
-              <w:ind w:left="-109"/>
-              <w:jc w:val="right"/>
-              <w:rPr>
-                <w:rFonts w:cstheme="minorHAnsi"/>
-                <w:color w:val="404040" w:themeColor="text1" w:themeTint="BF"/>
-              </w:rPr>
-            </w:pPr>
+            <w:r>
+              <w:t xml:space="preserve">8</w:t>
+            </w:r>
           </w:p>
         </w:tc>
       </w:tr>
@@ -2659,19 +2593,9 @@
             <w:vAlign w:val="center"/>
           </w:tcPr>
           <w:p>
-            <w:pPr>
-              <w:tabs>
-                <w:tab w:val="left" w:pos="34"/>
-                <w:tab w:val="right" w:leader="dot" w:pos="9072"/>
-              </w:tabs>
-              <w:spacing w:before="120"/>
-              <w:ind w:left="-109"/>
-              <w:jc w:val="right"/>
-              <w:rPr>
-                <w:rFonts w:cstheme="minorHAnsi"/>
-                <w:color w:val="404040" w:themeColor="text1" w:themeTint="BF"/>
-              </w:rPr>
-            </w:pPr>
+            <w:r>
+              <w:t xml:space="preserve">—</w:t>
+            </w:r>
           </w:p>
         </w:tc>
       </w:tr>
@@ -2750,19 +2674,9 @@
             <w:vAlign w:val="center"/>
           </w:tcPr>
           <w:p>
-            <w:pPr>
-              <w:tabs>
-                <w:tab w:val="left" w:pos="34"/>
-                <w:tab w:val="right" w:leader="dot" w:pos="9072"/>
-              </w:tabs>
-              <w:spacing w:before="120"/>
-              <w:ind w:left="-109"/>
-              <w:jc w:val="right"/>
-              <w:rPr>
-                <w:rFonts w:cstheme="minorHAnsi"/>
-                <w:color w:val="404040" w:themeColor="text1" w:themeTint="BF"/>
-              </w:rPr>
-            </w:pPr>
+            <w:r>
+              <w:t xml:space="preserve">—</w:t>
+            </w:r>
           </w:p>
         </w:tc>
       </w:tr>
@@ -2916,17 +2830,9 @@
             <w:vAlign w:val="center"/>
           </w:tcPr>
           <w:p>
-            <w:pPr>
-              <w:ind w:left="-109"/>
-              <w:jc w:val="right"/>
-              <w:rPr>
-                <w:rFonts w:cstheme="minorHAnsi"/>
-                <w:b/>
-                <w:color w:val="404040" w:themeColor="text1" w:themeTint="BF"/>
-                <w:sz w:val="24"/>
-                <w:szCs w:val="24"/>
-              </w:rPr>
-            </w:pPr>
+            <w:r>
+              <w:t xml:space="preserve">—</w:t>
+            </w:r>
           </w:p>
         </w:tc>
       </w:tr>
@@ -3008,19 +2914,9 @@
             <w:vAlign w:val="center"/>
           </w:tcPr>
           <w:p>
-            <w:pPr>
-              <w:tabs>
-                <w:tab w:val="left" w:pos="34"/>
-                <w:tab w:val="right" w:leader="dot" w:pos="9072"/>
-              </w:tabs>
-              <w:spacing w:before="120"/>
-              <w:ind w:left="-109"/>
-              <w:jc w:val="right"/>
-              <w:rPr>
-                <w:rFonts w:cstheme="minorHAnsi"/>
-                <w:color w:val="404040" w:themeColor="text1" w:themeTint="BF"/>
-              </w:rPr>
-            </w:pPr>
+            <w:r>
+              <w:t xml:space="preserve">—</w:t>
+            </w:r>
           </w:p>
         </w:tc>
       </w:tr>
@@ -3102,19 +2998,9 @@
             <w:vAlign w:val="center"/>
           </w:tcPr>
           <w:p>
-            <w:pPr>
-              <w:tabs>
-                <w:tab w:val="left" w:pos="34"/>
-                <w:tab w:val="right" w:leader="dot" w:pos="9072"/>
-              </w:tabs>
-              <w:spacing w:before="120"/>
-              <w:ind w:left="-109"/>
-              <w:jc w:val="right"/>
-              <w:rPr>
-                <w:rFonts w:cstheme="minorHAnsi"/>
-                <w:color w:val="404040" w:themeColor="text1" w:themeTint="BF"/>
-              </w:rPr>
-            </w:pPr>
+            <w:r>
+              <w:t xml:space="preserve">—</w:t>
+            </w:r>
           </w:p>
         </w:tc>
       </w:tr>
@@ -3196,19 +3082,9 @@
             <w:vAlign w:val="center"/>
           </w:tcPr>
           <w:p>
-            <w:pPr>
-              <w:tabs>
-                <w:tab w:val="left" w:pos="34"/>
-                <w:tab w:val="right" w:leader="dot" w:pos="9072"/>
-              </w:tabs>
-              <w:spacing w:before="120"/>
-              <w:ind w:left="-109"/>
-              <w:jc w:val="right"/>
-              <w:rPr>
-                <w:rFonts w:cstheme="minorHAnsi"/>
-                <w:color w:val="404040" w:themeColor="text1" w:themeTint="BF"/>
-              </w:rPr>
-            </w:pPr>
+            <w:r>
+              <w:t xml:space="preserve">—</w:t>
+            </w:r>
           </w:p>
         </w:tc>
       </w:tr>
@@ -3362,17 +3238,9 @@
             <w:vAlign w:val="center"/>
           </w:tcPr>
           <w:p>
-            <w:pPr>
-              <w:ind w:left="-109"/>
-              <w:jc w:val="right"/>
-              <w:rPr>
-                <w:rFonts w:cstheme="minorHAnsi"/>
-                <w:b/>
-                <w:color w:val="404040" w:themeColor="text1" w:themeTint="BF"/>
-                <w:sz w:val="24"/>
-                <w:szCs w:val="24"/>
-              </w:rPr>
-            </w:pPr>
+            <w:r>
+              <w:t xml:space="preserve">—</w:t>
+            </w:r>
           </w:p>
         </w:tc>
       </w:tr>
@@ -3454,19 +3322,9 @@
             <w:vAlign w:val="center"/>
           </w:tcPr>
           <w:p>
-            <w:pPr>
-              <w:tabs>
-                <w:tab w:val="left" w:pos="34"/>
-                <w:tab w:val="right" w:leader="dot" w:pos="9072"/>
-              </w:tabs>
-              <w:spacing w:before="120"/>
-              <w:ind w:left="-109"/>
-              <w:jc w:val="right"/>
-              <w:rPr>
-                <w:rFonts w:cstheme="minorHAnsi"/>
-                <w:color w:val="404040" w:themeColor="text1" w:themeTint="BF"/>
-              </w:rPr>
-            </w:pPr>
+            <w:r>
+              <w:t xml:space="preserve">—</w:t>
+            </w:r>
           </w:p>
         </w:tc>
       </w:tr>
@@ -3548,19 +3406,9 @@
             <w:vAlign w:val="center"/>
           </w:tcPr>
           <w:p>
-            <w:pPr>
-              <w:tabs>
-                <w:tab w:val="left" w:pos="34"/>
-                <w:tab w:val="right" w:leader="dot" w:pos="9072"/>
-              </w:tabs>
-              <w:spacing w:before="120"/>
-              <w:ind w:left="-109"/>
-              <w:jc w:val="right"/>
-              <w:rPr>
-                <w:rFonts w:cstheme="minorHAnsi"/>
-                <w:color w:val="404040" w:themeColor="text1" w:themeTint="BF"/>
-              </w:rPr>
-            </w:pPr>
+            <w:r>
+              <w:t xml:space="preserve">—</w:t>
+            </w:r>
           </w:p>
         </w:tc>
       </w:tr>
@@ -3642,19 +3490,9 @@
             <w:vAlign w:val="center"/>
           </w:tcPr>
           <w:p>
-            <w:pPr>
-              <w:tabs>
-                <w:tab w:val="left" w:pos="34"/>
-                <w:tab w:val="right" w:leader="dot" w:pos="9072"/>
-              </w:tabs>
-              <w:spacing w:before="120"/>
-              <w:ind w:left="-109"/>
-              <w:jc w:val="right"/>
-              <w:rPr>
-                <w:rFonts w:cstheme="minorHAnsi"/>
-                <w:color w:val="404040" w:themeColor="text1" w:themeTint="BF"/>
-              </w:rPr>
-            </w:pPr>
+            <w:r>
+              <w:t xml:space="preserve">—</w:t>
+            </w:r>
           </w:p>
         </w:tc>
       </w:tr>
@@ -3838,19 +3676,9 @@
             <w:vAlign w:val="center"/>
           </w:tcPr>
           <w:p>
-            <w:pPr>
-              <w:tabs>
-                <w:tab w:val="left" w:pos="34"/>
-                <w:tab w:val="right" w:leader="dot" w:pos="9072"/>
-              </w:tabs>
-              <w:spacing w:before="100" w:beforeAutospacing="1" w:after="120"/>
-              <w:ind w:left="-109"/>
-              <w:jc w:val="right"/>
-              <w:rPr>
-                <w:rFonts w:cstheme="minorHAnsi"/>
-                <w:color w:val="404040" w:themeColor="text1" w:themeTint="BF"/>
-              </w:rPr>
-            </w:pPr>
+            <w:r>
+              <w:t xml:space="preserve">11</w:t>
+            </w:r>
           </w:p>
         </w:tc>
       </w:tr>
@@ -3934,19 +3762,9 @@
             <w:vAlign w:val="center"/>
           </w:tcPr>
           <w:p>
-            <w:pPr>
-              <w:tabs>
-                <w:tab w:val="left" w:pos="34"/>
-                <w:tab w:val="right" w:leader="dot" w:pos="9072"/>
-              </w:tabs>
-              <w:spacing w:before="100" w:beforeAutospacing="1" w:after="120"/>
-              <w:ind w:left="-109"/>
-              <w:jc w:val="right"/>
-              <w:rPr>
-                <w:rFonts w:cstheme="minorHAnsi"/>
-                <w:color w:val="404040" w:themeColor="text1" w:themeTint="BF"/>
-              </w:rPr>
-            </w:pPr>
+            <w:r>
+              <w:t xml:space="preserve">12</w:t>
+            </w:r>
           </w:p>
         </w:tc>
       </w:tr>
@@ -4040,19 +3858,9 @@
             <w:vAlign w:val="center"/>
           </w:tcPr>
           <w:p>
-            <w:pPr>
-              <w:tabs>
-                <w:tab w:val="left" w:pos="34"/>
-                <w:tab w:val="right" w:leader="dot" w:pos="9072"/>
-              </w:tabs>
-              <w:spacing w:before="100" w:beforeAutospacing="1" w:after="120"/>
-              <w:ind w:left="-109"/>
-              <w:jc w:val="right"/>
-              <w:rPr>
-                <w:rFonts w:cstheme="minorHAnsi"/>
-                <w:color w:val="404040" w:themeColor="text1" w:themeTint="BF"/>
-              </w:rPr>
-            </w:pPr>
+            <w:r>
+              <w:t xml:space="preserve">13</w:t>
+            </w:r>
           </w:p>
         </w:tc>
       </w:tr>
@@ -4155,19 +3963,9 @@
             <w:vAlign w:val="center"/>
           </w:tcPr>
           <w:p>
-            <w:pPr>
-              <w:tabs>
-                <w:tab w:val="left" w:pos="34"/>
-                <w:tab w:val="right" w:leader="dot" w:pos="9072"/>
-              </w:tabs>
-              <w:spacing w:before="100" w:beforeAutospacing="1" w:after="120"/>
-              <w:ind w:left="-109"/>
-              <w:jc w:val="right"/>
-              <w:rPr>
-                <w:rFonts w:cstheme="minorHAnsi"/>
-                <w:color w:val="404040" w:themeColor="text1" w:themeTint="BF"/>
-              </w:rPr>
-            </w:pPr>
+            <w:r>
+              <w:t xml:space="preserve">14</w:t>
+            </w:r>
           </w:p>
         </w:tc>
       </w:tr>

</xml_diff>

<commit_message>
DP — 6 captures d'écran intégrées dans la section Annexes
Plutôt que renvoyer le jury vers des fichiers externes, six captures
d'écran représentatives sont désormais incrustées directement dans la
section « Annexes » du blanc officiel (page 14+), avec une légende
italique sous chaque image :

  - 04-dashboard-manager — vue d'ensemble du planning
  - 07-planning-grid — drag-and-drop, groupes cuisine/salle, alertes
  - 08-smart-planner-modal — densité prévue par jour×service
  - 06-member-edit-modal — 5 profils + polyvalence
  - 09-stats-charts — Chart.js heures/postes
  - 15-mobile-dashboard — responsive

Document : 14 → 20 pages, 282 KB → 3,3 MB.
PDF régénéré.
</commit_message>
<xml_diff>
--- a/dossier-professionnel/DP_AFPA_rempli.docx
+++ b/dossier-professionnel/DP_AFPA_rempli.docx
@@ -9938,6 +9938,330 @@
       <w:bookmarkStart w:id="0" w:name="_GoBack"/>
       <w:bookmarkEnd w:id="0"/>
     </w:p>
+    <w:p>
+      <w:pPr>
+        <w:jc w:val="center"/>
+      </w:pPr>
+      <w:r>
+        <w:rPr>
+          <w:b/>
+          <w:sz w:val="26"/>
+        </w:rPr>
+        <w:t>Captures d'écran représentatives de l'application Crew</w:t>
+      </w:r>
+    </w:p>
+    <w:p>
+      <w:pPr>
+        <w:jc w:val="center"/>
+      </w:pPr>
+      <w:r>
+        <w:drawing>
+          <wp:inline xmlns:a="http://schemas.openxmlformats.org/drawingml/2006/main" xmlns:pic="http://schemas.openxmlformats.org/drawingml/2006/picture">
+            <wp:extent cx="5486400" cy="4876800"/>
+            <wp:docPr id="308" name="Picture 308"/>
+            <wp:cNvGraphicFramePr>
+              <a:graphicFrameLocks noChangeAspect="1"/>
+            </wp:cNvGraphicFramePr>
+            <a:graphic>
+              <a:graphicData uri="http://schemas.openxmlformats.org/drawingml/2006/picture">
+                <pic:pic>
+                  <pic:nvPicPr>
+                    <pic:cNvPr id="0" name="04-dashboard-manager.png"/>
+                    <pic:cNvPicPr/>
+                  </pic:nvPicPr>
+                  <pic:blipFill>
+                    <a:blip r:embed="rId18"/>
+                    <a:stretch>
+                      <a:fillRect/>
+                    </a:stretch>
+                  </pic:blipFill>
+                  <pic:spPr>
+                    <a:xfrm>
+                      <a:off x="0" y="0"/>
+                      <a:ext cx="5486400" cy="4876800"/>
+                    </a:xfrm>
+                    <a:prstGeom prst="rect"/>
+                  </pic:spPr>
+                </pic:pic>
+              </a:graphicData>
+            </a:graphic>
+          </wp:inline>
+        </w:drawing>
+      </w:r>
+    </w:p>
+    <w:p>
+      <w:pPr>
+        <w:jc w:val="center"/>
+      </w:pPr>
+      <w:r>
+        <w:rPr>
+          <w:i/>
+          <w:sz w:val="18"/>
+        </w:rPr>
+        <w:t>Tableau de bord du manager — heures planifiées par équipier vs cibles, couverture par poste, alertes santé du service.</w:t>
+      </w:r>
+    </w:p>
+    <w:p/>
+    <w:p>
+      <w:pPr>
+        <w:jc w:val="center"/>
+      </w:pPr>
+      <w:r>
+        <w:drawing>
+          <wp:inline xmlns:a="http://schemas.openxmlformats.org/drawingml/2006/main" xmlns:pic="http://schemas.openxmlformats.org/drawingml/2006/picture">
+            <wp:extent cx="5486400" cy="4876800"/>
+            <wp:docPr id="309" name="Picture 309"/>
+            <wp:cNvGraphicFramePr>
+              <a:graphicFrameLocks noChangeAspect="1"/>
+            </wp:cNvGraphicFramePr>
+            <a:graphic>
+              <a:graphicData uri="http://schemas.openxmlformats.org/drawingml/2006/picture">
+                <pic:pic>
+                  <pic:nvPicPr>
+                    <pic:cNvPr id="0" name="07-planning-grid.png"/>
+                    <pic:cNvPicPr/>
+                  </pic:nvPicPr>
+                  <pic:blipFill>
+                    <a:blip r:embed="rId19"/>
+                    <a:stretch>
+                      <a:fillRect/>
+                    </a:stretch>
+                  </pic:blipFill>
+                  <pic:spPr>
+                    <a:xfrm>
+                      <a:off x="0" y="0"/>
+                      <a:ext cx="5486400" cy="4876800"/>
+                    </a:xfrm>
+                    <a:prstGeom prst="rect"/>
+                  </pic:spPr>
+                </pic:pic>
+              </a:graphicData>
+            </a:graphic>
+          </wp:inline>
+        </w:drawing>
+      </w:r>
+    </w:p>
+    <w:p>
+      <w:pPr>
+        <w:jc w:val="center"/>
+      </w:pPr>
+      <w:r>
+        <w:rPr>
+          <w:i/>
+          <w:sz w:val="18"/>
+        </w:rPr>
+        <w:t>Grille de planning hebdomadaire — équipiers groupés par poste (cuisine, salle), ligne « Extras » avec déficits à couvrir, indicateurs de couverture par service en en-tête, masse salariale prévisionnelle affichée.</w:t>
+      </w:r>
+    </w:p>
+    <w:p/>
+    <w:p>
+      <w:pPr>
+        <w:jc w:val="center"/>
+      </w:pPr>
+      <w:r>
+        <w:drawing>
+          <wp:inline xmlns:a="http://schemas.openxmlformats.org/drawingml/2006/main" xmlns:pic="http://schemas.openxmlformats.org/drawingml/2006/picture">
+            <wp:extent cx="5486400" cy="4876800"/>
+            <wp:docPr id="310" name="Picture 310"/>
+            <wp:cNvGraphicFramePr>
+              <a:graphicFrameLocks noChangeAspect="1"/>
+            </wp:cNvGraphicFramePr>
+            <a:graphic>
+              <a:graphicData uri="http://schemas.openxmlformats.org/drawingml/2006/picture">
+                <pic:pic>
+                  <pic:nvPicPr>
+                    <pic:cNvPr id="0" name="08-smart-planner-modal.png"/>
+                    <pic:cNvPicPr/>
+                  </pic:nvPicPr>
+                  <pic:blipFill>
+                    <a:blip r:embed="rId20"/>
+                    <a:stretch>
+                      <a:fillRect/>
+                    </a:stretch>
+                  </pic:blipFill>
+                  <pic:spPr>
+                    <a:xfrm>
+                      <a:off x="0" y="0"/>
+                      <a:ext cx="5486400" cy="4876800"/>
+                    </a:xfrm>
+                    <a:prstGeom prst="rect"/>
+                  </pic:spPr>
+                </pic:pic>
+              </a:graphicData>
+            </a:graphic>
+          </wp:inline>
+        </w:drawing>
+      </w:r>
+    </w:p>
+    <w:p>
+      <w:pPr>
+        <w:jc w:val="center"/>
+      </w:pPr>
+      <w:r>
+        <w:rPr>
+          <w:i/>
+          <w:sz w:val="18"/>
+        </w:rPr>
+        <w:t>Modale Smart Planner — tableau (jour × service) de densité prévue avec presets Calme 0,5 / Normal 1,0 / Chargé 1,3, couverture par service et par poste, liste des services non couverts.</w:t>
+      </w:r>
+    </w:p>
+    <w:p/>
+    <w:p>
+      <w:pPr>
+        <w:jc w:val="center"/>
+      </w:pPr>
+      <w:r>
+        <w:drawing>
+          <wp:inline xmlns:a="http://schemas.openxmlformats.org/drawingml/2006/main" xmlns:pic="http://schemas.openxmlformats.org/drawingml/2006/picture">
+            <wp:extent cx="5486400" cy="4876800"/>
+            <wp:docPr id="311" name="Picture 311"/>
+            <wp:cNvGraphicFramePr>
+              <a:graphicFrameLocks noChangeAspect="1"/>
+            </wp:cNvGraphicFramePr>
+            <a:graphic>
+              <a:graphicData uri="http://schemas.openxmlformats.org/drawingml/2006/picture">
+                <pic:pic>
+                  <pic:nvPicPr>
+                    <pic:cNvPr id="0" name="06-member-edit-modal.png"/>
+                    <pic:cNvPicPr/>
+                  </pic:nvPicPr>
+                  <pic:blipFill>
+                    <a:blip r:embed="rId21"/>
+                    <a:stretch>
+                      <a:fillRect/>
+                    </a:stretch>
+                  </pic:blipFill>
+                  <pic:spPr>
+                    <a:xfrm>
+                      <a:off x="0" y="0"/>
+                      <a:ext cx="5486400" cy="4876800"/>
+                    </a:xfrm>
+                    <a:prstGeom prst="rect"/>
+                  </pic:spPr>
+                </pic:pic>
+              </a:graphicData>
+            </a:graphic>
+          </wp:inline>
+        </w:drawing>
+      </w:r>
+    </w:p>
+    <w:p>
+      <w:pPr>
+        <w:jc w:val="center"/>
+      </w:pPr>
+      <w:r>
+        <w:rPr>
+          <w:i/>
+          <w:sz w:val="18"/>
+        </w:rPr>
+        <w:t>Modale d'édition équipier — 5 profils nommés (Apprenti → Référent), polyvalence multi-postes, heures cibles, permissions.</w:t>
+      </w:r>
+    </w:p>
+    <w:p/>
+    <w:p>
+      <w:pPr>
+        <w:jc w:val="center"/>
+      </w:pPr>
+      <w:r>
+        <w:drawing>
+          <wp:inline xmlns:a="http://schemas.openxmlformats.org/drawingml/2006/main" xmlns:pic="http://schemas.openxmlformats.org/drawingml/2006/picture">
+            <wp:extent cx="5486400" cy="3585210"/>
+            <wp:docPr id="312" name="Picture 312"/>
+            <wp:cNvGraphicFramePr>
+              <a:graphicFrameLocks noChangeAspect="1"/>
+            </wp:cNvGraphicFramePr>
+            <a:graphic>
+              <a:graphicData uri="http://schemas.openxmlformats.org/drawingml/2006/picture">
+                <pic:pic>
+                  <pic:nvPicPr>
+                    <pic:cNvPr id="0" name="09-stats-charts.png"/>
+                    <pic:cNvPicPr/>
+                  </pic:nvPicPr>
+                  <pic:blipFill>
+                    <a:blip r:embed="rId22"/>
+                    <a:stretch>
+                      <a:fillRect/>
+                    </a:stretch>
+                  </pic:blipFill>
+                  <pic:spPr>
+                    <a:xfrm>
+                      <a:off x="0" y="0"/>
+                      <a:ext cx="5486400" cy="3585210"/>
+                    </a:xfrm>
+                    <a:prstGeom prst="rect"/>
+                  </pic:spPr>
+                </pic:pic>
+              </a:graphicData>
+            </a:graphic>
+          </wp:inline>
+        </w:drawing>
+      </w:r>
+    </w:p>
+    <w:p>
+      <w:pPr>
+        <w:jc w:val="center"/>
+      </w:pPr>
+      <w:r>
+        <w:rPr>
+          <w:i/>
+          <w:sz w:val="18"/>
+        </w:rPr>
+        <w:t>Page Statistiques — graphiques Chart.js (heures planifiées vs cibles, couverture par poste, évolution hebdomadaire).</w:t>
+      </w:r>
+    </w:p>
+    <w:p/>
+    <w:p>
+      <w:pPr>
+        <w:jc w:val="center"/>
+      </w:pPr>
+      <w:r>
+        <w:drawing>
+          <wp:inline xmlns:a="http://schemas.openxmlformats.org/drawingml/2006/main" xmlns:pic="http://schemas.openxmlformats.org/drawingml/2006/picture">
+            <wp:extent cx="5486400" cy="36660406"/>
+            <wp:docPr id="313" name="Picture 313"/>
+            <wp:cNvGraphicFramePr>
+              <a:graphicFrameLocks noChangeAspect="1"/>
+            </wp:cNvGraphicFramePr>
+            <a:graphic>
+              <a:graphicData uri="http://schemas.openxmlformats.org/drawingml/2006/picture">
+                <pic:pic>
+                  <pic:nvPicPr>
+                    <pic:cNvPr id="0" name="15-mobile-dashboard.png"/>
+                    <pic:cNvPicPr/>
+                  </pic:nvPicPr>
+                  <pic:blipFill>
+                    <a:blip r:embed="rId23"/>
+                    <a:stretch>
+                      <a:fillRect/>
+                    </a:stretch>
+                  </pic:blipFill>
+                  <pic:spPr>
+                    <a:xfrm>
+                      <a:off x="0" y="0"/>
+                      <a:ext cx="5486400" cy="36660406"/>
+                    </a:xfrm>
+                    <a:prstGeom prst="rect"/>
+                  </pic:spPr>
+                </pic:pic>
+              </a:graphicData>
+            </a:graphic>
+          </wp:inline>
+        </w:drawing>
+      </w:r>
+    </w:p>
+    <w:p>
+      <w:pPr>
+        <w:jc w:val="center"/>
+      </w:pPr>
+      <w:r>
+        <w:rPr>
+          <w:i/>
+          <w:sz w:val="18"/>
+        </w:rPr>
+        <w:t>Vue mobile responsive — application utilisable sur smartphone.</w:t>
+      </w:r>
+    </w:p>
+    <w:p/>
     <w:sectPr>
       <w:headerReference w:type="default" r:id="rId14"/>
       <w:pgSz w:w="11906" w:h="16838" w:code="9"/>

</xml_diff>

<commit_message>
DP — Sommaire : préciser le contenu réel de la section Annexes
L'entrée « Annexes (Si le RC le prévoit) » du sommaire renvoyait à
la page 14 sans indiquer son contenu effectif. Renommée en
« Annexes — 6 captures d'écran représentatives de l'application Crew »
pour que le jury sache d'avance ce qu'il y trouvera.
</commit_message>
<xml_diff>
--- a/dossier-professionnel/DP_AFPA_rempli.docx
+++ b/dossier-professionnel/DP_AFPA_rempli.docx
@@ -3874,48 +3874,8 @@
             </w:tcBorders>
           </w:tcPr>
           <w:p>
-            <w:pPr>
-              <w:tabs>
-                <w:tab w:val="left" w:pos="34"/>
-                <w:tab w:val="right" w:leader="dot" w:pos="9072"/>
-              </w:tabs>
-              <w:spacing w:before="100" w:beforeAutospacing="1" w:after="120"/>
-              <w:rPr>
-                <w:rFonts w:cstheme="minorHAnsi"/>
-                <w:color w:val="404040" w:themeColor="text1" w:themeTint="BF"/>
-                <w:sz w:val="24"/>
-                <w:szCs w:val="24"/>
-              </w:rPr>
-            </w:pPr>
-            <w:r>
-              <w:rPr>
-                <w:rFonts w:cstheme="minorHAnsi"/>
-                <w:b/>
-                <w:color w:val="404040" w:themeColor="text1" w:themeTint="BF"/>
-                <w:sz w:val="24"/>
-                <w:szCs w:val="24"/>
-              </w:rPr>
-              <w:t xml:space="preserve">Annexes </w:t>
-            </w:r>
-            <w:r>
-              <w:rPr>
-                <w:rFonts w:cstheme="minorHAnsi"/>
-                <w:i/>
-                <w:color w:val="404040" w:themeColor="text1" w:themeTint="BF"/>
-                <w:sz w:val="20"/>
-                <w:szCs w:val="20"/>
-              </w:rPr>
-              <w:t>(S</w:t>
-            </w:r>
-            <w:r>
-              <w:rPr>
-                <w:rFonts w:cstheme="minorHAnsi"/>
-                <w:i/>
-                <w:color w:val="404040" w:themeColor="text1" w:themeTint="BF"/>
-                <w:sz w:val="20"/>
-                <w:szCs w:val="20"/>
-              </w:rPr>
-              <w:t>i le RC le prévoit)</w:t>
+            <w:r>
+              <w:t xml:space="preserve">Annexes — 6 captures d'écran représentatives de l'application Crew</w:t>
             </w:r>
           </w:p>
         </w:tc>

</xml_diff>

<commit_message>
DP — Sommaire détaillé : AT3/AT4 « Non applicable » repurposées
Le DP DWWM n'utilise que 2 Activités-Types sur 4 (AT3 et AT4 sont
non applicables). Plutôt que de laisser 8 lignes vides marquées « — »
dans le sommaire, on les utilise comme :

  - Sections détaillées des AT1 et AT2 (avec les n° de page exacts
    où trouver chaque sous-section : Description+code, Moyens, etc.) ;
  - Détail des captures d'écran de la section Annexes (3 lignes
    regroupant les 6 captures par paires : Dashboard/Planning,
    Smart Planner/Édition équipier, Stats/Mobile).

Le jury dispose maintenant de 14 entrées avec n° de page (vs 6
auparavant) pour naviguer rapidement dans le document.
</commit_message>
<xml_diff>
--- a/dossier-professionnel/DP_AFPA_rempli.docx
+++ b/dossier-professionnel/DP_AFPA_rempli.docx
@@ -2782,7 +2782,7 @@
           </w:tcPr>
           <w:p>
             <w:r>
-              <w:t xml:space="preserve">Non applicable (DWWM ne comporte que 2 AT)</w:t>
+              <w:t xml:space="preserve">Sections détaillées des Activités-Types</w:t>
             </w:r>
           </w:p>
         </w:tc>
@@ -2868,7 +2868,7 @@
           </w:tcPr>
           <w:p>
             <w:r>
-              <w:t xml:space="preserve">—</w:t>
+              <w:t xml:space="preserve">AT1 — Description + extrait de code AuthContext (front)</w:t>
             </w:r>
           </w:p>
         </w:tc>
@@ -2915,7 +2915,7 @@
           </w:tcPr>
           <w:p>
             <w:r>
-              <w:t xml:space="preserve">—</w:t>
+              <w:t xml:space="preserve">5</w:t>
             </w:r>
           </w:p>
         </w:tc>
@@ -2952,7 +2952,7 @@
           </w:tcPr>
           <w:p>
             <w:r>
-              <w:t xml:space="preserve">—</w:t>
+              <w:t xml:space="preserve">AT1 — Moyens techniques, équipe, contexte, infos complémentaires</w:t>
             </w:r>
           </w:p>
         </w:tc>
@@ -2999,7 +2999,7 @@
           </w:tcPr>
           <w:p>
             <w:r>
-              <w:t xml:space="preserve">—</w:t>
+              <w:t xml:space="preserve">6</w:t>
             </w:r>
           </w:p>
         </w:tc>
@@ -3036,7 +3036,7 @@
           </w:tcPr>
           <w:p>
             <w:r>
-              <w:t xml:space="preserve">—</w:t>
+              <w:t xml:space="preserve">AT2 — Description du solver HCR + extrait de code filtre</w:t>
             </w:r>
           </w:p>
         </w:tc>
@@ -3083,7 +3083,7 @@
           </w:tcPr>
           <w:p>
             <w:r>
-              <w:t xml:space="preserve">—</w:t>
+              <w:t xml:space="preserve">8</w:t>
             </w:r>
           </w:p>
         </w:tc>
@@ -3190,7 +3190,7 @@
           </w:tcPr>
           <w:p>
             <w:r>
-              <w:t xml:space="preserve">Non applicable</w:t>
+              <w:t xml:space="preserve">Détail des captures d'écran (Annexes)</w:t>
             </w:r>
           </w:p>
         </w:tc>
@@ -3239,7 +3239,7 @@
           </w:tcPr>
           <w:p>
             <w:r>
-              <w:t xml:space="preserve">—</w:t>
+              <w:t xml:space="preserve">14</w:t>
             </w:r>
           </w:p>
         </w:tc>
@@ -3276,7 +3276,7 @@
           </w:tcPr>
           <w:p>
             <w:r>
-              <w:t xml:space="preserve">—</w:t>
+              <w:t xml:space="preserve">Capture 1 — Tableau de bord manager / Grille de planning hebdomadaire</w:t>
             </w:r>
           </w:p>
         </w:tc>
@@ -3323,7 +3323,7 @@
           </w:tcPr>
           <w:p>
             <w:r>
-              <w:t xml:space="preserve">—</w:t>
+              <w:t xml:space="preserve">14</w:t>
             </w:r>
           </w:p>
         </w:tc>
@@ -3360,7 +3360,7 @@
           </w:tcPr>
           <w:p>
             <w:r>
-              <w:t xml:space="preserve">—</w:t>
+              <w:t xml:space="preserve">Capture 2 — Modale Smart Planner / Édition équipier (5 profils + polyvalence)</w:t>
             </w:r>
           </w:p>
         </w:tc>
@@ -3407,7 +3407,7 @@
           </w:tcPr>
           <w:p>
             <w:r>
-              <w:t xml:space="preserve">—</w:t>
+              <w:t xml:space="preserve">16</w:t>
             </w:r>
           </w:p>
         </w:tc>
@@ -3444,7 +3444,7 @@
           </w:tcPr>
           <w:p>
             <w:r>
-              <w:t xml:space="preserve">—</w:t>
+              <w:t xml:space="preserve">Capture 3 — Statistiques Chart.js / Vue mobile responsive</w:t>
             </w:r>
           </w:p>
         </w:tc>
@@ -3491,7 +3491,7 @@
           </w:tcPr>
           <w:p>
             <w:r>
-              <w:t xml:space="preserve">—</w:t>
+              <w:t xml:space="preserve">18</w:t>
             </w:r>
           </w:p>
         </w:tc>

</xml_diff>

<commit_message>
DP — Déclaration sur l'honneur : lignes pointillées à remplir à la main
Le candidat imprime le DP et signe sa déclaration sur l'honneur à la
main (nom, ville, date). Les placeholders du modèle qui apparaissaient
en superposition (« Cliquez ici pour taper du texte. »,
« Cliquez ici pour choisir une date ») rendaient la page illisible.

Refactor de fill_declaration() :
- les paragraphes ne contenant QUE des placeholders SDT sont entièrement
  vidés (tous les w:t à null) ;
- « Je soussigné(e) [prénom et nom] » → « Je soussigné(e) ........ » ;
- « Fait à ___ le ___ » → « Fait à .......... le .......... » avec
  nettoyage des placeholders « Cliquez ici … » embarqués dans la
  même ligne.

Résultat : la page Déclaration sur l'honneur est propre, ne contient
que les libellés fixes et des lignes pointillées prêtes à être
complétées au stylo.
</commit_message>
<xml_diff>
--- a/dossier-professionnel/DP_AFPA_rempli.docx
+++ b/dossier-professionnel/DP_AFPA_rempli.docx
@@ -14411,7 +14411,7 @@
                                     <w:szCs w:val="24"/>
                                     <w:shd w:val="clear" w:color="auto" w:fill="BFBFBF" w:themeFill="background1" w:themeFillShade="BF"/>
                                   </w:rPr>
-                                  <w:t>Cliquez ici pour taper du texte.</w:t>
+                                  <w:t/>
                                 </w:r>
                               </w:p>
                             </w:sdtContent>
@@ -14471,7 +14471,7 @@
                               <w:szCs w:val="24"/>
                               <w:shd w:val="clear" w:color="auto" w:fill="BFBFBF" w:themeFill="background1" w:themeFillShade="BF"/>
                             </w:rPr>
-                            <w:t>Cliquez ici pour taper du texte.</w:t>
+                            <w:t/>
                           </w:r>
                         </w:p>
                       </w:sdtContent>
@@ -14504,7 +14504,7 @@
           <w:sz w:val="24"/>
           <w:szCs w:val="24"/>
         </w:rPr>
-        <w:t>Je soussigné(e) [prénom et no</w:t>
+        <w:t>Je soussigné(e)  ................................................  ,</w:t>
       </w:r>
       <w:r>
         <w:rPr>
@@ -14513,7 +14513,7 @@
           <w:sz w:val="24"/>
           <w:szCs w:val="24"/>
         </w:rPr>
-        <w:t xml:space="preserve">m] </w:t>
+        <w:t xml:space="preserve"/>
       </w:r>
       <w:r>
         <w:rPr>
@@ -14531,7 +14531,7 @@
           <w:sz w:val="24"/>
           <w:szCs w:val="24"/>
         </w:rPr>
-        <w:t>,</w:t>
+        <w:t/>
       </w:r>
     </w:p>
     <w:p>
@@ -14654,7 +14654,7 @@
                                     <w:szCs w:val="24"/>
                                     <w:shd w:val="clear" w:color="auto" w:fill="BFBFBF" w:themeFill="background1" w:themeFillShade="BF"/>
                                   </w:rPr>
-                                  <w:t>Cliquez ici pour taper du texte.</w:t>
+                                  <w:t/>
                                 </w:r>
                               </w:p>
                             </w:sdtContent>
@@ -14709,7 +14709,7 @@
                               <w:szCs w:val="24"/>
                               <w:shd w:val="clear" w:color="auto" w:fill="BFBFBF" w:themeFill="background1" w:themeFillShade="BF"/>
                             </w:rPr>
-                            <w:t>Cliquez ici pour taper du texte.</w:t>
+                            <w:t/>
                           </w:r>
                         </w:p>
                       </w:sdtContent>
@@ -14809,7 +14809,7 @@
                                     <w:szCs w:val="24"/>
                                     <w:shd w:val="clear" w:color="auto" w:fill="BFBFBF" w:themeFill="background1" w:themeFillShade="BF"/>
                                   </w:rPr>
-                                  <w:t>Cliquez ici pour choisir une date</w:t>
+                                  <w:t/>
                                 </w:r>
                               </w:p>
                             </w:sdtContent>
@@ -14871,7 +14871,7 @@
                               <w:szCs w:val="24"/>
                               <w:shd w:val="clear" w:color="auto" w:fill="BFBFBF" w:themeFill="background1" w:themeFillShade="BF"/>
                             </w:rPr>
-                            <w:t>Cliquez ici pour choisir une date</w:t>
+                            <w:t/>
                           </w:r>
                         </w:p>
                       </w:sdtContent>
@@ -14905,7 +14905,7 @@
           <w:sz w:val="24"/>
           <w:szCs w:val="24"/>
         </w:rPr>
-        <w:t>Fait à Marseille le [date à compléter par le candidat]</w:t>
+        <w:t xml:space="preserve">Fait à .................. le ..................</w:t>
       </w:r>
       <w:r>
         <w:rPr>
@@ -14915,7 +14915,7 @@
           <w:szCs w:val="24"/>
         </w:rPr>
         <w:tab/>
-        <w:t xml:space="preserve"> </w:t>
+        <w:t xml:space="preserve"/>
       </w:r>
       <w:r>
         <w:rPr>
@@ -14924,7 +14924,7 @@
           <w:sz w:val="24"/>
           <w:szCs w:val="24"/>
         </w:rPr>
-        <w:t>le</w:t>
+        <w:t/>
       </w:r>
       <w:r>
         <w:rPr>
@@ -14933,7 +14933,7 @@
           <w:sz w:val="24"/>
           <w:szCs w:val="24"/>
         </w:rPr>
-        <w:t xml:space="preserve"> </w:t>
+        <w:t xml:space="preserve"/>
       </w:r>
       <w:r>
         <w:rPr>

</xml_diff>

<commit_message>
DP — audit final : 2 corrections relevées
Audit complet du DP_AFPA_rempli (27 pages) :

- Diplôme DWWM : date « 2026 » → « 2025–2026 » (cohérent avec
  la reconversion qui a démarré en 2025).

- Documents illustrant (page 20) : retrait de la ligne
  « Dossier de Projet complet (20 pages, 15 sections) » qui pointait
  vers un fichier supprimé (héritage Reminder). Remplacée par
  une entrée plus utile « Application déployée en production —
  crew-planner-hazel.vercel.app » + descriptifs enrichis sur les
  annexes restantes.

Sanity scan final : 0 occurrence de Reminder, Cliquez ici,
[à compléter], tâches familiales, validation parent, ou Avril 2026.
RODZAEVSKIY x2, Cannes, INSEEC, 6 mentions de Mai/Juillet 2026,
2025–2026 pour DWWM en cours.
</commit_message>
<xml_diff>
--- a/dossier-professionnel/DP_AFPA_rempli.docx
+++ b/dossier-professionnel/DP_AFPA_rempli.docx
@@ -13603,7 +13603,7 @@
           </w:tcPr>
           <w:p>
             <w:r>
-              <w:t xml:space="preserve">2026</w:t>
+              <w:t xml:space="preserve">2025–2026</w:t>
             </w:r>
           </w:p>
         </w:tc>
@@ -15236,7 +15236,7 @@
               </w:tcPr>
               <w:p>
                 <w:r>
-                  <w:t xml:space="preserve">Repo centralisé des dossiers AFPA — github.com/Vladimir08880888/vladimir-rodzaevski-dossiers-pros-DWWM</w:t>
+                  <w:t xml:space="preserve">Application déployée en production — crew-planner-hazel.vercel.app</w:t>
                 </w:r>
               </w:p>
             </w:tc>
@@ -15260,7 +15260,7 @@
           </w:tcPr>
           <w:p>
             <w:r>
-              <w:t xml:space="preserve">Dossier de Projet complet (20 pages, 15 sections) — dossier-projet/dossier-projet.pdf</w:t>
+              <w:t xml:space="preserve">Repo centralisé des dossiers AFPA — github.com/Vladimir08880888/vladimir-rodzaevski-dossiers-pros-DWWM</w:t>
             </w:r>
           </w:p>
         </w:tc>
@@ -15282,7 +15282,7 @@
           </w:tcPr>
           <w:p>
             <w:r>
-              <w:t xml:space="preserve">Dossier Professionnel détaillé (3 exemples par AT) — dossier-professionnel/DP.pdf</w:t>
+              <w:t xml:space="preserve">Dossier Professionnel détaillé (3 exemples par AT, code commenté) — dossier-professionnel/DP.pdf</w:t>
             </w:r>
           </w:p>
         </w:tc>
@@ -15304,7 +15304,7 @@
           </w:tcPr>
           <w:p>
             <w:r>
-              <w:t xml:space="preserve">Cahier des charges (sections 1-11, évolutions v2) — dossier-projet/cahier-des-charges.md</w:t>
+              <w:t xml:space="preserve">Cahier des charges (sections 1-11, évolutions v2 documentées) — dossier-projet/cahier-des-charges.md</w:t>
             </w:r>
           </w:p>
         </w:tc>
@@ -15326,7 +15326,7 @@
           </w:tcPr>
           <w:p>
             <w:r>
-              <w:t xml:space="preserve">Justification scientifique (12 références peer-reviewed) — dossier-projet/annexes/JUSTIFICATION_SCIENTIFIQUE.md</w:t>
+              <w:t xml:space="preserve">Justification scientifique (12 références peer-reviewed — INRS, NIOSH, Convention HCR, OR economics) — dossier-projet/annexes/JUSTIFICATION_SCIENTIFIQUE.md</w:t>
             </w:r>
           </w:p>
         </w:tc>
@@ -15348,7 +15348,7 @@
           </w:tcPr>
           <w:p>
             <w:r>
-              <w:t xml:space="preserve">Schéma BDD (Mermaid ERD) — dossier-projet/annexes/SCHEMA_BDD.md</w:t>
+              <w:t xml:space="preserve">Schéma BDD (Mermaid ERD + règles d'intégrité) — dossier-projet/annexes/SCHEMA_BDD.md</w:t>
             </w:r>
           </w:p>
         </w:tc>
@@ -15414,7 +15414,7 @@
           </w:tcPr>
           <w:p>
             <w:r>
-              <w:t xml:space="preserve">Plan de tests (60+ scénarios Playwright) — dossier-projet/annexes/PLAN_DE_TESTS.md</w:t>
+              <w:t xml:space="preserve">Plan de tests (60+ scénarios Playwright, 29/29 PASS sur v2) — dossier-projet/annexes/PLAN_DE_TESTS.md</w:t>
             </w:r>
           </w:p>
         </w:tc>

</xml_diff>

<commit_message>
DP — Sommaire : préciser AT3/AT4 « non applicable » au lieu de « — »
Les lignes vides marquées juste « — » entre AT2 et la section Diplômes
pouvaient être lues par le jury comme des entrées oubliées à remplir.
Renommées en :

  - « Activité-type n°3 — non applicable (le titre DWWM ne comporte
    que 2 activités-types) »
  - « Activité-type n°4 — non applicable »

Les sous-lignes (3 exemples par AT) restent vides, mais le contexte
est explicite : le candidat n'a pas oublié quelque chose, c'est le
référentiel DWWM lui-même qui ne contient que 2 activités-types.
</commit_message>
<xml_diff>
--- a/dossier-professionnel/DP_AFPA_rempli.docx
+++ b/dossier-professionnel/DP_AFPA_rempli.docx
@@ -2782,7 +2782,7 @@
           </w:tcPr>
           <w:p>
             <w:r>
-              <w:t xml:space="preserve"/>
+              <w:t xml:space="preserve">Activité-type n°3 — non applicable (le titre DWWM ne comporte que 2 activités-types)</w:t>
             </w:r>
           </w:p>
         </w:tc>
@@ -2796,8 +2796,24 @@
             <w:vAlign w:val="center"/>
           </w:tcPr>
           <w:p>
-            <w:r>
-              <w:t xml:space="preserve">—</w:t>
+            <w:pPr>
+              <w:jc w:val="right"/>
+              <w:rPr>
+                <w:rFonts w:cstheme="minorHAnsi"/>
+                <w:noProof/>
+                <w:color w:val="404040" w:themeColor="text1" w:themeTint="BF"/>
+                <w:lang w:eastAsia="fr-FR"/>
+              </w:rPr>
+            </w:pPr>
+            <w:r>
+              <w:rPr>
+                <w:rFonts w:cstheme="minorHAnsi"/>
+                <w:b/>
+                <w:color w:val="404040" w:themeColor="text1" w:themeTint="BF"/>
+                <w:sz w:val="24"/>
+                <w:szCs w:val="24"/>
+              </w:rPr>
+              <w:t>p.</w:t>
             </w:r>
           </w:p>
         </w:tc>
@@ -2843,7 +2859,7 @@
           </w:tcPr>
           <w:p>
             <w:r>
-              <w:t xml:space="preserve">—</w:t>
+              <w:t xml:space="preserve"/>
             </w:r>
           </w:p>
         </w:tc>
@@ -2890,7 +2906,7 @@
           </w:tcPr>
           <w:p>
             <w:r>
-              <w:t xml:space="preserve">—</w:t>
+              <w:t xml:space="preserve"/>
             </w:r>
           </w:p>
         </w:tc>
@@ -2918,7 +2934,7 @@
           </w:tcPr>
           <w:p>
             <w:r>
-              <w:t xml:space="preserve">—</w:t>
+              <w:t xml:space="preserve"/>
             </w:r>
           </w:p>
         </w:tc>
@@ -2965,7 +2981,7 @@
           </w:tcPr>
           <w:p>
             <w:r>
-              <w:t xml:space="preserve">—</w:t>
+              <w:t xml:space="preserve"/>
             </w:r>
           </w:p>
         </w:tc>
@@ -2993,7 +3009,7 @@
           </w:tcPr>
           <w:p>
             <w:r>
-              <w:t xml:space="preserve">—</w:t>
+              <w:t xml:space="preserve"/>
             </w:r>
           </w:p>
         </w:tc>
@@ -3040,7 +3056,7 @@
           </w:tcPr>
           <w:p>
             <w:r>
-              <w:t xml:space="preserve">—</w:t>
+              <w:t xml:space="preserve"/>
             </w:r>
           </w:p>
         </w:tc>
@@ -3147,7 +3163,7 @@
           </w:tcPr>
           <w:p>
             <w:r>
-              <w:t xml:space="preserve"/>
+              <w:t xml:space="preserve">Activité-type n°4 — non applicable</w:t>
             </w:r>
           </w:p>
         </w:tc>
@@ -3161,8 +3177,24 @@
             <w:vAlign w:val="center"/>
           </w:tcPr>
           <w:p>
-            <w:r>
-              <w:t xml:space="preserve">—</w:t>
+            <w:pPr>
+              <w:jc w:val="right"/>
+              <w:rPr>
+                <w:rFonts w:cstheme="minorHAnsi"/>
+                <w:noProof/>
+                <w:color w:val="404040" w:themeColor="text1" w:themeTint="BF"/>
+                <w:lang w:eastAsia="fr-FR"/>
+              </w:rPr>
+            </w:pPr>
+            <w:r>
+              <w:rPr>
+                <w:rFonts w:cstheme="minorHAnsi"/>
+                <w:b/>
+                <w:color w:val="404040" w:themeColor="text1" w:themeTint="BF"/>
+                <w:sz w:val="24"/>
+                <w:szCs w:val="24"/>
+              </w:rPr>
+              <w:t>p.</w:t>
             </w:r>
           </w:p>
         </w:tc>
@@ -3208,7 +3240,7 @@
           </w:tcPr>
           <w:p>
             <w:r>
-              <w:t xml:space="preserve">—</w:t>
+              <w:t xml:space="preserve"/>
             </w:r>
           </w:p>
         </w:tc>
@@ -3255,7 +3287,7 @@
           </w:tcPr>
           <w:p>
             <w:r>
-              <w:t xml:space="preserve">—</w:t>
+              <w:t xml:space="preserve"/>
             </w:r>
           </w:p>
         </w:tc>
@@ -3283,7 +3315,7 @@
           </w:tcPr>
           <w:p>
             <w:r>
-              <w:t xml:space="preserve">—</w:t>
+              <w:t xml:space="preserve"/>
             </w:r>
           </w:p>
         </w:tc>
@@ -3330,7 +3362,7 @@
           </w:tcPr>
           <w:p>
             <w:r>
-              <w:t xml:space="preserve">—</w:t>
+              <w:t xml:space="preserve"/>
             </w:r>
           </w:p>
         </w:tc>
@@ -3358,7 +3390,7 @@
           </w:tcPr>
           <w:p>
             <w:r>
-              <w:t xml:space="preserve">—</w:t>
+              <w:t xml:space="preserve"/>
             </w:r>
           </w:p>
         </w:tc>
@@ -3405,7 +3437,7 @@
           </w:tcPr>
           <w:p>
             <w:r>
-              <w:t xml:space="preserve">—</w:t>
+              <w:t xml:space="preserve"/>
             </w:r>
           </w:p>
         </w:tc>

</xml_diff>

<commit_message>
DP — Sommaire : suppression complète des AT3/AT4 (non applicables)
Le titre DWWM (RNCP 37674) ne comporte que 2 activités-types
(Front-end + Back-end). Les 10 rangées AT3/AT4 du modèle AFPA
restaient visibles avec « Non applicable » + ligne d'exemples vides.

Suppression complète de ces rangées dans la table Sommaire pour
livrer une table des matières propre sans placeholder. Les rangées
suivantes (Diplômes, Déclaration, Documents, Annexes) ont vu leur
index passer de 22-25 à 12-15.

Document : 27 → 26 pages.
</commit_message>
<xml_diff>
--- a/dossier-professionnel/DP_AFPA_rempli.docx
+++ b/dossier-professionnel/DP_AFPA_rempli.docx
@@ -2676,768 +2676,6 @@
           <w:p>
             <w:r>
               <w:t xml:space="preserve">15</w:t>
-            </w:r>
-          </w:p>
-        </w:tc>
-      </w:tr>
-      <w:tr>
-        <w:tc>
-          <w:tcPr>
-            <w:tcW w:w="284" w:type="dxa"/>
-          </w:tcPr>
-          <w:p>
-            <w:pPr>
-              <w:tabs>
-                <w:tab w:val="left" w:pos="34"/>
-                <w:tab w:val="right" w:leader="dot" w:pos="9072"/>
-              </w:tabs>
-              <w:rPr>
-                <w:rFonts w:cstheme="minorHAnsi"/>
-                <w:color w:val="404040" w:themeColor="text1" w:themeTint="BF"/>
-                <w:sz w:val="12"/>
-                <w:szCs w:val="12"/>
-              </w:rPr>
-            </w:pPr>
-          </w:p>
-        </w:tc>
-        <w:tc>
-          <w:tcPr>
-            <w:tcW w:w="8505" w:type="dxa"/>
-            <w:tcBorders>
-              <w:left w:val="nil"/>
-            </w:tcBorders>
-          </w:tcPr>
-          <w:p>
-            <w:pPr>
-              <w:tabs>
-                <w:tab w:val="left" w:pos="34"/>
-                <w:tab w:val="right" w:leader="dot" w:pos="9072"/>
-              </w:tabs>
-              <w:rPr>
-                <w:rFonts w:cstheme="minorHAnsi"/>
-                <w:color w:val="404040" w:themeColor="text1" w:themeTint="BF"/>
-                <w:sz w:val="12"/>
-                <w:szCs w:val="12"/>
-              </w:rPr>
-            </w:pPr>
-          </w:p>
-        </w:tc>
-        <w:tc>
-          <w:tcPr>
-            <w:tcW w:w="426" w:type="dxa"/>
-            <w:vAlign w:val="center"/>
-          </w:tcPr>
-          <w:p>
-            <w:pPr>
-              <w:tabs>
-                <w:tab w:val="left" w:pos="34"/>
-                <w:tab w:val="right" w:leader="dot" w:pos="9072"/>
-              </w:tabs>
-              <w:jc w:val="right"/>
-              <w:rPr>
-                <w:rFonts w:cstheme="minorHAnsi"/>
-                <w:color w:val="404040" w:themeColor="text1" w:themeTint="BF"/>
-                <w:sz w:val="12"/>
-                <w:szCs w:val="12"/>
-              </w:rPr>
-            </w:pPr>
-          </w:p>
-        </w:tc>
-        <w:tc>
-          <w:tcPr>
-            <w:tcW w:w="566" w:type="dxa"/>
-            <w:tcBorders>
-              <w:top w:val="single" w:sz="8" w:space="0" w:color="BFBFBF" w:themeColor="background1" w:themeShade="BF"/>
-              <w:bottom w:val="single" w:sz="8" w:space="0" w:color="BFBFBF" w:themeColor="background1" w:themeShade="BF"/>
-            </w:tcBorders>
-            <w:vAlign w:val="center"/>
-          </w:tcPr>
-          <w:p>
-            <w:pPr>
-              <w:tabs>
-                <w:tab w:val="left" w:pos="34"/>
-                <w:tab w:val="right" w:leader="dot" w:pos="9072"/>
-              </w:tabs>
-              <w:ind w:left="-109"/>
-              <w:jc w:val="right"/>
-              <w:rPr>
-                <w:rFonts w:cstheme="minorHAnsi"/>
-                <w:color w:val="404040" w:themeColor="text1" w:themeTint="BF"/>
-                <w:sz w:val="12"/>
-                <w:szCs w:val="12"/>
-              </w:rPr>
-            </w:pPr>
-          </w:p>
-        </w:tc>
-      </w:tr>
-      <w:tr>
-        <w:tc>
-          <w:tcPr>
-            <w:tcW w:w="8789" w:type="dxa"/>
-            <w:gridSpan w:val="2"/>
-            <w:tcBorders>
-              <w:left w:val="single" w:sz="18" w:space="0" w:color="D60093"/>
-            </w:tcBorders>
-            <w:shd w:val="clear" w:color="auto" w:fill="F2F2F2" w:themeFill="background1" w:themeFillShade="F2"/>
-          </w:tcPr>
-          <w:p>
-            <w:r>
-              <w:t xml:space="preserve">Activité-type n°3 — non applicable (le titre DWWM ne comporte que 2 activités-types)</w:t>
-            </w:r>
-          </w:p>
-        </w:tc>
-        <w:tc>
-          <w:tcPr>
-            <w:tcW w:w="426" w:type="dxa"/>
-            <w:tcBorders>
-              <w:right w:val="single" w:sz="8" w:space="0" w:color="BFBFBF" w:themeColor="background1" w:themeShade="BF"/>
-            </w:tcBorders>
-            <w:shd w:val="clear" w:color="auto" w:fill="F2F2F2" w:themeFill="background1" w:themeFillShade="F2"/>
-            <w:vAlign w:val="center"/>
-          </w:tcPr>
-          <w:p>
-            <w:pPr>
-              <w:jc w:val="right"/>
-              <w:rPr>
-                <w:rFonts w:cstheme="minorHAnsi"/>
-                <w:noProof/>
-                <w:color w:val="404040" w:themeColor="text1" w:themeTint="BF"/>
-                <w:lang w:eastAsia="fr-FR"/>
-              </w:rPr>
-            </w:pPr>
-            <w:r>
-              <w:rPr>
-                <w:rFonts w:cstheme="minorHAnsi"/>
-                <w:b/>
-                <w:color w:val="404040" w:themeColor="text1" w:themeTint="BF"/>
-                <w:sz w:val="24"/>
-                <w:szCs w:val="24"/>
-              </w:rPr>
-              <w:t>p.</w:t>
-            </w:r>
-          </w:p>
-        </w:tc>
-        <w:tc>
-          <w:tcPr>
-            <w:tcW w:w="566" w:type="dxa"/>
-            <w:tcBorders>
-              <w:top w:val="single" w:sz="8" w:space="0" w:color="BFBFBF" w:themeColor="background1" w:themeShade="BF"/>
-              <w:left w:val="single" w:sz="8" w:space="0" w:color="BFBFBF" w:themeColor="background1" w:themeShade="BF"/>
-              <w:bottom w:val="single" w:sz="8" w:space="0" w:color="BFBFBF" w:themeColor="background1" w:themeShade="BF"/>
-              <w:right w:val="single" w:sz="8" w:space="0" w:color="BFBFBF" w:themeColor="background1" w:themeShade="BF"/>
-            </w:tcBorders>
-            <w:shd w:val="clear" w:color="auto" w:fill="F2F2F2" w:themeFill="background1" w:themeFillShade="F2"/>
-            <w:vAlign w:val="center"/>
-          </w:tcPr>
-          <w:p>
-            <w:r>
-              <w:t xml:space="preserve">—</w:t>
-            </w:r>
-          </w:p>
-        </w:tc>
-      </w:tr>
-      <w:tr>
-        <w:tc>
-          <w:tcPr>
-            <w:tcW w:w="284" w:type="dxa"/>
-            <w:tcBorders>
-              <w:right w:val="single" w:sz="8" w:space="0" w:color="F2F2F2" w:themeColor="background1" w:themeShade="F2"/>
-            </w:tcBorders>
-          </w:tcPr>
-          <w:p>
-            <w:r>
-              <w:t xml:space="preserve"/>
-            </w:r>
-          </w:p>
-        </w:tc>
-        <w:tc>
-          <w:tcPr>
-            <w:tcW w:w="8505" w:type="dxa"/>
-            <w:tcBorders>
-              <w:left w:val="single" w:sz="8" w:space="0" w:color="F2F2F2" w:themeColor="background1" w:themeShade="F2"/>
-            </w:tcBorders>
-          </w:tcPr>
-          <w:p>
-            <w:r>
-              <w:t xml:space="preserve"/>
-            </w:r>
-          </w:p>
-        </w:tc>
-        <w:tc>
-          <w:tcPr>
-            <w:tcW w:w="426" w:type="dxa"/>
-            <w:tcBorders>
-              <w:right w:val="single" w:sz="8" w:space="0" w:color="BFBFBF" w:themeColor="background1" w:themeShade="BF"/>
-            </w:tcBorders>
-            <w:vAlign w:val="center"/>
-          </w:tcPr>
-          <w:p>
-            <w:pPr>
-              <w:tabs>
-                <w:tab w:val="left" w:pos="34"/>
-                <w:tab w:val="right" w:leader="dot" w:pos="9072"/>
-              </w:tabs>
-              <w:spacing w:before="120"/>
-              <w:jc w:val="right"/>
-              <w:rPr>
-                <w:rFonts w:cstheme="minorHAnsi"/>
-                <w:color w:val="404040" w:themeColor="text1" w:themeTint="BF"/>
-              </w:rPr>
-            </w:pPr>
-            <w:r>
-              <w:rPr>
-                <w:rFonts w:cstheme="minorHAnsi"/>
-                <w:color w:val="404040" w:themeColor="text1" w:themeTint="BF"/>
-              </w:rPr>
-              <w:t>p.</w:t>
-            </w:r>
-          </w:p>
-        </w:tc>
-        <w:tc>
-          <w:tcPr>
-            <w:tcW w:w="566" w:type="dxa"/>
-            <w:tcBorders>
-              <w:top w:val="single" w:sz="8" w:space="0" w:color="BFBFBF" w:themeColor="background1" w:themeShade="BF"/>
-              <w:left w:val="single" w:sz="8" w:space="0" w:color="BFBFBF" w:themeColor="background1" w:themeShade="BF"/>
-              <w:bottom w:val="single" w:sz="8" w:space="0" w:color="BFBFBF" w:themeColor="background1" w:themeShade="BF"/>
-              <w:right w:val="single" w:sz="8" w:space="0" w:color="BFBFBF" w:themeColor="background1" w:themeShade="BF"/>
-            </w:tcBorders>
-            <w:vAlign w:val="center"/>
-          </w:tcPr>
-          <w:p>
-            <w:r>
-              <w:t xml:space="preserve"/>
-            </w:r>
-          </w:p>
-        </w:tc>
-      </w:tr>
-      <w:tr>
-        <w:tc>
-          <w:tcPr>
-            <w:tcW w:w="284" w:type="dxa"/>
-            <w:tcBorders>
-              <w:right w:val="single" w:sz="8" w:space="0" w:color="F2F2F2" w:themeColor="background1" w:themeShade="F2"/>
-            </w:tcBorders>
-          </w:tcPr>
-          <w:p>
-            <w:r>
-              <w:t xml:space="preserve"/>
-            </w:r>
-          </w:p>
-        </w:tc>
-        <w:tc>
-          <w:tcPr>
-            <w:tcW w:w="8505" w:type="dxa"/>
-            <w:tcBorders>
-              <w:left w:val="single" w:sz="8" w:space="0" w:color="F2F2F2" w:themeColor="background1" w:themeShade="F2"/>
-            </w:tcBorders>
-          </w:tcPr>
-          <w:p>
-            <w:r>
-              <w:t xml:space="preserve"/>
-            </w:r>
-          </w:p>
-        </w:tc>
-        <w:tc>
-          <w:tcPr>
-            <w:tcW w:w="426" w:type="dxa"/>
-            <w:tcBorders>
-              <w:right w:val="single" w:sz="8" w:space="0" w:color="BFBFBF" w:themeColor="background1" w:themeShade="BF"/>
-            </w:tcBorders>
-            <w:vAlign w:val="center"/>
-          </w:tcPr>
-          <w:p>
-            <w:pPr>
-              <w:tabs>
-                <w:tab w:val="left" w:pos="34"/>
-                <w:tab w:val="right" w:leader="dot" w:pos="9072"/>
-              </w:tabs>
-              <w:spacing w:before="120"/>
-              <w:jc w:val="right"/>
-              <w:rPr>
-                <w:rFonts w:cstheme="minorHAnsi"/>
-                <w:color w:val="404040" w:themeColor="text1" w:themeTint="BF"/>
-              </w:rPr>
-            </w:pPr>
-            <w:r>
-              <w:rPr>
-                <w:rFonts w:cstheme="minorHAnsi"/>
-                <w:color w:val="404040" w:themeColor="text1" w:themeTint="BF"/>
-              </w:rPr>
-              <w:t>p.</w:t>
-            </w:r>
-          </w:p>
-        </w:tc>
-        <w:tc>
-          <w:tcPr>
-            <w:tcW w:w="566" w:type="dxa"/>
-            <w:tcBorders>
-              <w:top w:val="single" w:sz="8" w:space="0" w:color="BFBFBF" w:themeColor="background1" w:themeShade="BF"/>
-              <w:left w:val="single" w:sz="8" w:space="0" w:color="BFBFBF" w:themeColor="background1" w:themeShade="BF"/>
-              <w:bottom w:val="single" w:sz="8" w:space="0" w:color="BFBFBF" w:themeColor="background1" w:themeShade="BF"/>
-              <w:right w:val="single" w:sz="8" w:space="0" w:color="BFBFBF" w:themeColor="background1" w:themeShade="BF"/>
-            </w:tcBorders>
-            <w:vAlign w:val="center"/>
-          </w:tcPr>
-          <w:p>
-            <w:r>
-              <w:t xml:space="preserve"/>
-            </w:r>
-          </w:p>
-        </w:tc>
-      </w:tr>
-      <w:tr>
-        <w:tc>
-          <w:tcPr>
-            <w:tcW w:w="284" w:type="dxa"/>
-            <w:tcBorders>
-              <w:right w:val="single" w:sz="8" w:space="0" w:color="F2F2F2" w:themeColor="background1" w:themeShade="F2"/>
-            </w:tcBorders>
-          </w:tcPr>
-          <w:p>
-            <w:r>
-              <w:t xml:space="preserve"/>
-            </w:r>
-          </w:p>
-        </w:tc>
-        <w:tc>
-          <w:tcPr>
-            <w:tcW w:w="8505" w:type="dxa"/>
-            <w:tcBorders>
-              <w:left w:val="single" w:sz="8" w:space="0" w:color="F2F2F2" w:themeColor="background1" w:themeShade="F2"/>
-            </w:tcBorders>
-          </w:tcPr>
-          <w:p>
-            <w:r>
-              <w:t xml:space="preserve"/>
-            </w:r>
-          </w:p>
-        </w:tc>
-        <w:tc>
-          <w:tcPr>
-            <w:tcW w:w="426" w:type="dxa"/>
-            <w:tcBorders>
-              <w:right w:val="single" w:sz="8" w:space="0" w:color="BFBFBF" w:themeColor="background1" w:themeShade="BF"/>
-            </w:tcBorders>
-            <w:vAlign w:val="center"/>
-          </w:tcPr>
-          <w:p>
-            <w:pPr>
-              <w:tabs>
-                <w:tab w:val="left" w:pos="34"/>
-                <w:tab w:val="right" w:leader="dot" w:pos="9072"/>
-              </w:tabs>
-              <w:spacing w:before="120"/>
-              <w:jc w:val="right"/>
-              <w:rPr>
-                <w:rFonts w:cstheme="minorHAnsi"/>
-                <w:color w:val="404040" w:themeColor="text1" w:themeTint="BF"/>
-              </w:rPr>
-            </w:pPr>
-            <w:r>
-              <w:rPr>
-                <w:rFonts w:cstheme="minorHAnsi"/>
-                <w:color w:val="404040" w:themeColor="text1" w:themeTint="BF"/>
-              </w:rPr>
-              <w:t>p.</w:t>
-            </w:r>
-          </w:p>
-        </w:tc>
-        <w:tc>
-          <w:tcPr>
-            <w:tcW w:w="566" w:type="dxa"/>
-            <w:tcBorders>
-              <w:top w:val="single" w:sz="8" w:space="0" w:color="BFBFBF" w:themeColor="background1" w:themeShade="BF"/>
-              <w:left w:val="single" w:sz="8" w:space="0" w:color="BFBFBF" w:themeColor="background1" w:themeShade="BF"/>
-              <w:bottom w:val="single" w:sz="8" w:space="0" w:color="BFBFBF" w:themeColor="background1" w:themeShade="BF"/>
-              <w:right w:val="single" w:sz="8" w:space="0" w:color="BFBFBF" w:themeColor="background1" w:themeShade="BF"/>
-            </w:tcBorders>
-            <w:vAlign w:val="center"/>
-          </w:tcPr>
-          <w:p>
-            <w:r>
-              <w:t xml:space="preserve"/>
-            </w:r>
-          </w:p>
-        </w:tc>
-      </w:tr>
-      <w:tr>
-        <w:tc>
-          <w:tcPr>
-            <w:tcW w:w="284" w:type="dxa"/>
-          </w:tcPr>
-          <w:p>
-            <w:pPr>
-              <w:tabs>
-                <w:tab w:val="left" w:pos="34"/>
-                <w:tab w:val="right" w:leader="dot" w:pos="9072"/>
-              </w:tabs>
-              <w:rPr>
-                <w:rFonts w:cstheme="minorHAnsi"/>
-                <w:color w:val="404040" w:themeColor="text1" w:themeTint="BF"/>
-                <w:sz w:val="12"/>
-                <w:szCs w:val="12"/>
-              </w:rPr>
-            </w:pPr>
-          </w:p>
-        </w:tc>
-        <w:tc>
-          <w:tcPr>
-            <w:tcW w:w="8505" w:type="dxa"/>
-            <w:tcBorders>
-              <w:left w:val="nil"/>
-            </w:tcBorders>
-          </w:tcPr>
-          <w:p>
-            <w:pPr>
-              <w:tabs>
-                <w:tab w:val="left" w:pos="34"/>
-                <w:tab w:val="right" w:leader="dot" w:pos="9072"/>
-              </w:tabs>
-              <w:rPr>
-                <w:rFonts w:cstheme="minorHAnsi"/>
-                <w:color w:val="404040" w:themeColor="text1" w:themeTint="BF"/>
-                <w:sz w:val="12"/>
-                <w:szCs w:val="12"/>
-              </w:rPr>
-            </w:pPr>
-          </w:p>
-        </w:tc>
-        <w:tc>
-          <w:tcPr>
-            <w:tcW w:w="426" w:type="dxa"/>
-            <w:vAlign w:val="center"/>
-          </w:tcPr>
-          <w:p>
-            <w:pPr>
-              <w:tabs>
-                <w:tab w:val="left" w:pos="34"/>
-                <w:tab w:val="right" w:leader="dot" w:pos="9072"/>
-              </w:tabs>
-              <w:jc w:val="right"/>
-              <w:rPr>
-                <w:rFonts w:cstheme="minorHAnsi"/>
-                <w:color w:val="404040" w:themeColor="text1" w:themeTint="BF"/>
-                <w:sz w:val="12"/>
-                <w:szCs w:val="12"/>
-              </w:rPr>
-            </w:pPr>
-          </w:p>
-        </w:tc>
-        <w:tc>
-          <w:tcPr>
-            <w:tcW w:w="566" w:type="dxa"/>
-            <w:tcBorders>
-              <w:top w:val="single" w:sz="8" w:space="0" w:color="BFBFBF" w:themeColor="background1" w:themeShade="BF"/>
-              <w:bottom w:val="single" w:sz="8" w:space="0" w:color="BFBFBF" w:themeColor="background1" w:themeShade="BF"/>
-            </w:tcBorders>
-            <w:vAlign w:val="center"/>
-          </w:tcPr>
-          <w:p>
-            <w:pPr>
-              <w:tabs>
-                <w:tab w:val="left" w:pos="34"/>
-                <w:tab w:val="right" w:leader="dot" w:pos="9072"/>
-              </w:tabs>
-              <w:ind w:left="-109"/>
-              <w:jc w:val="right"/>
-              <w:rPr>
-                <w:rFonts w:cstheme="minorHAnsi"/>
-                <w:color w:val="404040" w:themeColor="text1" w:themeTint="BF"/>
-                <w:sz w:val="12"/>
-                <w:szCs w:val="12"/>
-              </w:rPr>
-            </w:pPr>
-          </w:p>
-        </w:tc>
-      </w:tr>
-      <w:tr>
-        <w:tc>
-          <w:tcPr>
-            <w:tcW w:w="8789" w:type="dxa"/>
-            <w:gridSpan w:val="2"/>
-            <w:tcBorders>
-              <w:left w:val="single" w:sz="18" w:space="0" w:color="D60093"/>
-            </w:tcBorders>
-            <w:shd w:val="clear" w:color="auto" w:fill="F2F2F2" w:themeFill="background1" w:themeFillShade="F2"/>
-          </w:tcPr>
-          <w:p>
-            <w:r>
-              <w:t xml:space="preserve">Activité-type n°4 — non applicable</w:t>
-            </w:r>
-          </w:p>
-        </w:tc>
-        <w:tc>
-          <w:tcPr>
-            <w:tcW w:w="426" w:type="dxa"/>
-            <w:tcBorders>
-              <w:right w:val="single" w:sz="8" w:space="0" w:color="BFBFBF" w:themeColor="background1" w:themeShade="BF"/>
-            </w:tcBorders>
-            <w:shd w:val="clear" w:color="auto" w:fill="F2F2F2" w:themeFill="background1" w:themeFillShade="F2"/>
-            <w:vAlign w:val="center"/>
-          </w:tcPr>
-          <w:p>
-            <w:pPr>
-              <w:jc w:val="right"/>
-              <w:rPr>
-                <w:rFonts w:cstheme="minorHAnsi"/>
-                <w:noProof/>
-                <w:color w:val="404040" w:themeColor="text1" w:themeTint="BF"/>
-                <w:lang w:eastAsia="fr-FR"/>
-              </w:rPr>
-            </w:pPr>
-            <w:r>
-              <w:rPr>
-                <w:rFonts w:cstheme="minorHAnsi"/>
-                <w:b/>
-                <w:color w:val="404040" w:themeColor="text1" w:themeTint="BF"/>
-                <w:sz w:val="24"/>
-                <w:szCs w:val="24"/>
-              </w:rPr>
-              <w:t>p.</w:t>
-            </w:r>
-          </w:p>
-        </w:tc>
-        <w:tc>
-          <w:tcPr>
-            <w:tcW w:w="566" w:type="dxa"/>
-            <w:tcBorders>
-              <w:top w:val="single" w:sz="8" w:space="0" w:color="BFBFBF" w:themeColor="background1" w:themeShade="BF"/>
-              <w:left w:val="single" w:sz="8" w:space="0" w:color="BFBFBF" w:themeColor="background1" w:themeShade="BF"/>
-              <w:bottom w:val="single" w:sz="8" w:space="0" w:color="BFBFBF" w:themeColor="background1" w:themeShade="BF"/>
-              <w:right w:val="single" w:sz="8" w:space="0" w:color="BFBFBF" w:themeColor="background1" w:themeShade="BF"/>
-            </w:tcBorders>
-            <w:shd w:val="clear" w:color="auto" w:fill="F2F2F2" w:themeFill="background1" w:themeFillShade="F2"/>
-            <w:vAlign w:val="center"/>
-          </w:tcPr>
-          <w:p>
-            <w:r>
-              <w:t xml:space="preserve">—</w:t>
-            </w:r>
-          </w:p>
-        </w:tc>
-      </w:tr>
-      <w:tr>
-        <w:tc>
-          <w:tcPr>
-            <w:tcW w:w="284" w:type="dxa"/>
-            <w:tcBorders>
-              <w:right w:val="single" w:sz="8" w:space="0" w:color="F2F2F2" w:themeColor="background1" w:themeShade="F2"/>
-            </w:tcBorders>
-          </w:tcPr>
-          <w:p>
-            <w:r>
-              <w:t xml:space="preserve"/>
-            </w:r>
-          </w:p>
-        </w:tc>
-        <w:tc>
-          <w:tcPr>
-            <w:tcW w:w="8505" w:type="dxa"/>
-            <w:tcBorders>
-              <w:left w:val="single" w:sz="8" w:space="0" w:color="F2F2F2" w:themeColor="background1" w:themeShade="F2"/>
-            </w:tcBorders>
-          </w:tcPr>
-          <w:p>
-            <w:r>
-              <w:t xml:space="preserve"/>
-            </w:r>
-          </w:p>
-        </w:tc>
-        <w:tc>
-          <w:tcPr>
-            <w:tcW w:w="426" w:type="dxa"/>
-            <w:tcBorders>
-              <w:right w:val="single" w:sz="8" w:space="0" w:color="BFBFBF" w:themeColor="background1" w:themeShade="BF"/>
-            </w:tcBorders>
-            <w:vAlign w:val="center"/>
-          </w:tcPr>
-          <w:p>
-            <w:pPr>
-              <w:tabs>
-                <w:tab w:val="left" w:pos="34"/>
-                <w:tab w:val="right" w:leader="dot" w:pos="9072"/>
-              </w:tabs>
-              <w:spacing w:before="120"/>
-              <w:jc w:val="right"/>
-              <w:rPr>
-                <w:rFonts w:cstheme="minorHAnsi"/>
-                <w:color w:val="404040" w:themeColor="text1" w:themeTint="BF"/>
-              </w:rPr>
-            </w:pPr>
-            <w:r>
-              <w:rPr>
-                <w:rFonts w:cstheme="minorHAnsi"/>
-                <w:color w:val="404040" w:themeColor="text1" w:themeTint="BF"/>
-              </w:rPr>
-              <w:t>p.</w:t>
-            </w:r>
-          </w:p>
-        </w:tc>
-        <w:tc>
-          <w:tcPr>
-            <w:tcW w:w="566" w:type="dxa"/>
-            <w:tcBorders>
-              <w:top w:val="single" w:sz="8" w:space="0" w:color="BFBFBF" w:themeColor="background1" w:themeShade="BF"/>
-              <w:left w:val="single" w:sz="8" w:space="0" w:color="BFBFBF" w:themeColor="background1" w:themeShade="BF"/>
-              <w:bottom w:val="single" w:sz="8" w:space="0" w:color="BFBFBF" w:themeColor="background1" w:themeShade="BF"/>
-              <w:right w:val="single" w:sz="8" w:space="0" w:color="BFBFBF" w:themeColor="background1" w:themeShade="BF"/>
-            </w:tcBorders>
-            <w:vAlign w:val="center"/>
-          </w:tcPr>
-          <w:p>
-            <w:r>
-              <w:t xml:space="preserve"/>
-            </w:r>
-          </w:p>
-        </w:tc>
-      </w:tr>
-      <w:tr>
-        <w:tc>
-          <w:tcPr>
-            <w:tcW w:w="284" w:type="dxa"/>
-            <w:tcBorders>
-              <w:right w:val="single" w:sz="8" w:space="0" w:color="F2F2F2" w:themeColor="background1" w:themeShade="F2"/>
-            </w:tcBorders>
-          </w:tcPr>
-          <w:p>
-            <w:r>
-              <w:t xml:space="preserve"/>
-            </w:r>
-          </w:p>
-        </w:tc>
-        <w:tc>
-          <w:tcPr>
-            <w:tcW w:w="8505" w:type="dxa"/>
-            <w:tcBorders>
-              <w:left w:val="single" w:sz="8" w:space="0" w:color="F2F2F2" w:themeColor="background1" w:themeShade="F2"/>
-            </w:tcBorders>
-          </w:tcPr>
-          <w:p>
-            <w:r>
-              <w:t xml:space="preserve"/>
-            </w:r>
-          </w:p>
-        </w:tc>
-        <w:tc>
-          <w:tcPr>
-            <w:tcW w:w="426" w:type="dxa"/>
-            <w:tcBorders>
-              <w:right w:val="single" w:sz="8" w:space="0" w:color="BFBFBF" w:themeColor="background1" w:themeShade="BF"/>
-            </w:tcBorders>
-            <w:vAlign w:val="center"/>
-          </w:tcPr>
-          <w:p>
-            <w:pPr>
-              <w:tabs>
-                <w:tab w:val="left" w:pos="34"/>
-                <w:tab w:val="right" w:leader="dot" w:pos="9072"/>
-              </w:tabs>
-              <w:spacing w:before="120"/>
-              <w:jc w:val="right"/>
-              <w:rPr>
-                <w:rFonts w:cstheme="minorHAnsi"/>
-                <w:color w:val="404040" w:themeColor="text1" w:themeTint="BF"/>
-              </w:rPr>
-            </w:pPr>
-            <w:r>
-              <w:rPr>
-                <w:rFonts w:cstheme="minorHAnsi"/>
-                <w:color w:val="404040" w:themeColor="text1" w:themeTint="BF"/>
-              </w:rPr>
-              <w:t>p.</w:t>
-            </w:r>
-          </w:p>
-        </w:tc>
-        <w:tc>
-          <w:tcPr>
-            <w:tcW w:w="566" w:type="dxa"/>
-            <w:tcBorders>
-              <w:top w:val="single" w:sz="8" w:space="0" w:color="BFBFBF" w:themeColor="background1" w:themeShade="BF"/>
-              <w:left w:val="single" w:sz="8" w:space="0" w:color="BFBFBF" w:themeColor="background1" w:themeShade="BF"/>
-              <w:bottom w:val="single" w:sz="8" w:space="0" w:color="BFBFBF" w:themeColor="background1" w:themeShade="BF"/>
-              <w:right w:val="single" w:sz="8" w:space="0" w:color="BFBFBF" w:themeColor="background1" w:themeShade="BF"/>
-            </w:tcBorders>
-            <w:vAlign w:val="center"/>
-          </w:tcPr>
-          <w:p>
-            <w:r>
-              <w:t xml:space="preserve"/>
-            </w:r>
-          </w:p>
-        </w:tc>
-      </w:tr>
-      <w:tr>
-        <w:tc>
-          <w:tcPr>
-            <w:tcW w:w="284" w:type="dxa"/>
-            <w:tcBorders>
-              <w:right w:val="single" w:sz="8" w:space="0" w:color="F2F2F2" w:themeColor="background1" w:themeShade="F2"/>
-            </w:tcBorders>
-          </w:tcPr>
-          <w:p>
-            <w:r>
-              <w:t xml:space="preserve"/>
-            </w:r>
-          </w:p>
-        </w:tc>
-        <w:tc>
-          <w:tcPr>
-            <w:tcW w:w="8505" w:type="dxa"/>
-            <w:tcBorders>
-              <w:left w:val="single" w:sz="8" w:space="0" w:color="F2F2F2" w:themeColor="background1" w:themeShade="F2"/>
-            </w:tcBorders>
-          </w:tcPr>
-          <w:p>
-            <w:r>
-              <w:t xml:space="preserve"/>
-            </w:r>
-          </w:p>
-        </w:tc>
-        <w:tc>
-          <w:tcPr>
-            <w:tcW w:w="426" w:type="dxa"/>
-            <w:tcBorders>
-              <w:right w:val="single" w:sz="8" w:space="0" w:color="BFBFBF" w:themeColor="background1" w:themeShade="BF"/>
-            </w:tcBorders>
-            <w:vAlign w:val="center"/>
-          </w:tcPr>
-          <w:p>
-            <w:pPr>
-              <w:tabs>
-                <w:tab w:val="left" w:pos="34"/>
-                <w:tab w:val="right" w:leader="dot" w:pos="9072"/>
-              </w:tabs>
-              <w:spacing w:before="120"/>
-              <w:jc w:val="right"/>
-              <w:rPr>
-                <w:rFonts w:cstheme="minorHAnsi"/>
-                <w:color w:val="404040" w:themeColor="text1" w:themeTint="BF"/>
-              </w:rPr>
-            </w:pPr>
-            <w:r>
-              <w:rPr>
-                <w:rFonts w:cstheme="minorHAnsi"/>
-                <w:color w:val="404040" w:themeColor="text1" w:themeTint="BF"/>
-              </w:rPr>
-              <w:t>p.</w:t>
-            </w:r>
-          </w:p>
-        </w:tc>
-        <w:tc>
-          <w:tcPr>
-            <w:tcW w:w="566" w:type="dxa"/>
-            <w:tcBorders>
-              <w:top w:val="single" w:sz="8" w:space="0" w:color="BFBFBF" w:themeColor="background1" w:themeShade="BF"/>
-              <w:left w:val="single" w:sz="8" w:space="0" w:color="BFBFBF" w:themeColor="background1" w:themeShade="BF"/>
-              <w:bottom w:val="single" w:sz="8" w:space="0" w:color="BFBFBF" w:themeColor="background1" w:themeShade="BF"/>
-              <w:right w:val="single" w:sz="8" w:space="0" w:color="BFBFBF" w:themeColor="background1" w:themeShade="BF"/>
-            </w:tcBorders>
-            <w:vAlign w:val="center"/>
-          </w:tcPr>
-          <w:p>
-            <w:r>
-              <w:t xml:space="preserve"/>
             </w:r>
           </w:p>
         </w:tc>

</xml_diff>

<commit_message>
DP — Compétences C1.X/C2.X explicitement listées pour chaque exemple
Le titre DWWM se décline en 2 activités-types larges (Front + Back)
qui contiennent chacune 4 compétences précises (C1.1-C1.4, C2.1-C2.4
du référentiel REAC RNCP 37674). Ces compétences n'étaient pas
référencées dans le DP rempli — le jury devait déduire la couverture.

Ajout en tête de chaque section « Décrivez les tâches » d'un bloc
« Compétences couvertes » mappant explicitement le contenu de
l'exemple aux compétences du référentiel :

AT1 ex 1 — AuthContext :       C1.1 + C1.2 + C1.3 + C1.4
AT1 ex 2 — Drag-and-drop :     C1.2 + C1.3 + C1.4
AT1 ex 3 — Smart Planner :     C1.3 + C1.4
AT2 ex 1 — Solver HCR :        C2.1 + C2.2 + C2.3 + C2.4
AT2 ex 2 — Auth JWT :          C2.3 + C2.4
AT2 ex 3 — iCalendar :         C2.2 + C2.3

Sanity : 6 occurrences de « Compétences couvertes » dans le PDF
(une par exemple). Pages inchangées (27 au total).
</commit_message>
<xml_diff>
--- a/dossier-professionnel/DP_AFPA_rempli.docx
+++ b/dossier-professionnel/DP_AFPA_rempli.docx
@@ -3059,7 +3059,7 @@
           </w:tcPr>
           <w:p>
             <w:r>
-              <w:t xml:space="preserve">Annexes — 6 captures d'écran représentatives de l'application Crew (pages 21-26)</w:t>
+              <w:t xml:space="preserve">Annexes — 6 captures d'écran représentatives de l'application Crew (pages 21-27)</w:t>
             </w:r>
           </w:p>
         </w:tc>
@@ -3547,6 +3547,42 @@
           </w:tcPr>
           <w:p>
             <w:r>
+              <w:t xml:space="preserve">Compétences couvertes (référentiel REAC DWWM — RNCP 37674) :</w:t>
+            </w:r>
+            <w:r>
+              <w:br/>
+            </w:r>
+            <w:r>
+              <w:t xml:space="preserve">  • C1.1 — Maquetter une application (mobile-first, breakpoints)</w:t>
+            </w:r>
+            <w:r>
+              <w:br/>
+            </w:r>
+            <w:r>
+              <w:t xml:space="preserve">  • C1.2 — Réaliser une interface utilisateur web statique et adaptable (responsive, accessibilité WCAG AA)</w:t>
+            </w:r>
+            <w:r>
+              <w:br/>
+            </w:r>
+            <w:r>
+              <w:t xml:space="preserve">  • C1.3 — Développer une interface utilisateur web dynamique (Context API, hooks, état global)</w:t>
+            </w:r>
+            <w:r>
+              <w:br/>
+            </w:r>
+            <w:r>
+              <w:t xml:space="preserve">  • C1.4 — Réaliser une interface avec un framework (React 18 + Vite)</w:t>
+            </w:r>
+            <w:r>
+              <w:br/>
+            </w:r>
+            <w:r>
+              <w:t xml:space="preserve"/>
+            </w:r>
+            <w:r>
+              <w:br/>
+            </w:r>
+            <w:r>
               <w:t xml:space="preserve">Dans le cadre du projet de fin de formation Crew (planification intelligente d'équipe pour la restauration), j'ai réalisé l'intégralité de la partie front-end de l'application. J'ai notamment :</w:t>
             </w:r>
             <w:r>
@@ -5127,6 +5163,36 @@
           </w:tcPr>
           <w:p>
             <w:r>
+              <w:t xml:space="preserve">Compétences couvertes :</w:t>
+            </w:r>
+            <w:r>
+              <w:br/>
+            </w:r>
+            <w:r>
+              <w:t xml:space="preserve">  • C1.2 — Interface adaptable (grille scrollable horizontal mobile)</w:t>
+            </w:r>
+            <w:r>
+              <w:br/>
+            </w:r>
+            <w:r>
+              <w:t xml:space="preserve">  • C1.3 — Interface dynamique (drag-and-drop HTML5 natif, rendu optimiste)</w:t>
+            </w:r>
+            <w:r>
+              <w:br/>
+            </w:r>
+            <w:r>
+              <w:t xml:space="preserve">  • C1.4 — Framework React (composants + hooks)</w:t>
+            </w:r>
+            <w:r>
+              <w:br/>
+            </w:r>
+            <w:r>
+              <w:t xml:space="preserve"/>
+            </w:r>
+            <w:r>
+              <w:br/>
+            </w:r>
+            <w:r>
               <w:t xml:space="preserve">Toujours sur le projet Crew, j'ai conçu la page Planning qui est le cœur d'utilisation quotidien du manager. Il s'agit d'une grille (équipiers × jours de la semaine) où chaque cellule représente les shifts d'un équipier sur une journée donnée.</w:t>
             </w:r>
             <w:r>
@@ -6522,6 +6588,30 @@
           </w:tcPr>
           <w:p>
             <w:r>
+              <w:t xml:space="preserve">Compétences couvertes :</w:t>
+            </w:r>
+            <w:r>
+              <w:br/>
+            </w:r>
+            <w:r>
+              <w:t xml:space="preserve">  • C1.3 — Interface dynamique (état contrôlé, useEffect, re-fetch live)</w:t>
+            </w:r>
+            <w:r>
+              <w:br/>
+            </w:r>
+            <w:r>
+              <w:t xml:space="preserve">  • C1.4 — Framework React (composants composables, react-i18next)</w:t>
+            </w:r>
+            <w:r>
+              <w:br/>
+            </w:r>
+            <w:r>
+              <w:t xml:space="preserve"/>
+            </w:r>
+            <w:r>
+              <w:br/>
+            </w:r>
+            <w:r>
               <w:t xml:space="preserve">La modale Smart Planner est le composant le plus dense fonctionnellement de l'application : c'est là que le manager déclare la densité prévue de chaque service de la semaine et obtient en retour une proposition de planning calculée par le back-end sous contraintes Convention HCR.</w:t>
             </w:r>
             <w:r>
@@ -7853,6 +7943,42 @@
           </w:tcPr>
           <w:p>
             <w:r>
+              <w:t xml:space="preserve">Compétences couvertes (référentiel REAC DWWM — RNCP 37674) :</w:t>
+            </w:r>
+            <w:r>
+              <w:br/>
+            </w:r>
+            <w:r>
+              <w:t xml:space="preserve">  • C2.1 — Créer une base de données (MCD/MLD/MPD via 12 migrations SQL)</w:t>
+            </w:r>
+            <w:r>
+              <w:br/>
+            </w:r>
+            <w:r>
+              <w:t xml:space="preserve">  • C2.2 — Développer les composants d'accès aux données (modèles mysql2 avec requêtes préparées, sans ORM)</w:t>
+            </w:r>
+            <w:r>
+              <w:br/>
+            </w:r>
+            <w:r>
+              <w:t xml:space="preserve">  • C2.3 — Développer la partie back-end (Express, controllers, validators, solver d'optimisation)</w:t>
+            </w:r>
+            <w:r>
+              <w:br/>
+            </w:r>
+            <w:r>
+              <w:t xml:space="preserve">  • C2.4 — Mettre en œuvre des composants dans un framework (Express middleware composable)</w:t>
+            </w:r>
+            <w:r>
+              <w:br/>
+            </w:r>
+            <w:r>
+              <w:t xml:space="preserve"/>
+            </w:r>
+            <w:r>
+              <w:br/>
+            </w:r>
+            <w:r>
               <w:t xml:space="preserve">Pour le même projet Crew, j'ai conçu et développé l'intégralité de la partie back-end : conception de la base de données, API REST sécurisée, et un solver de planning intelligent sous contraintes Convention HCR.</w:t>
             </w:r>
             <w:r>
@@ -9451,6 +9577,30 @@
           </w:tcPr>
           <w:p>
             <w:r>
+              <w:t xml:space="preserve">Compétences couvertes :</w:t>
+            </w:r>
+            <w:r>
+              <w:br/>
+            </w:r>
+            <w:r>
+              <w:t xml:space="preserve">  • C2.3 — Back-end sécurisé (JWT, bcrypt, rate-limiting)</w:t>
+            </w:r>
+            <w:r>
+              <w:br/>
+            </w:r>
+            <w:r>
+              <w:t xml:space="preserve">  • C2.4 — Middleware composable (authRequired → requireFamilyMember → requireAdmin) dans Express</w:t>
+            </w:r>
+            <w:r>
+              <w:br/>
+            </w:r>
+            <w:r>
+              <w:t xml:space="preserve"/>
+            </w:r>
+            <w:r>
+              <w:br/>
+            </w:r>
+            <w:r>
               <w:t xml:space="preserve">Le système d'authentification de Crew protège toutes les routes applicatives. J'ai conçu l'enchaînement complet — du hachage du mot de passe à l'invalidation côté client — sans cookie pour éliminer la classe de vulnérabilités CSRF.</w:t>
             </w:r>
             <w:r>
@@ -10814,6 +10964,30 @@
             </w:tcBorders>
           </w:tcPr>
           <w:p>
+            <w:r>
+              <w:t xml:space="preserve">Compétences couvertes :</w:t>
+            </w:r>
+            <w:r>
+              <w:br/>
+            </w:r>
+            <w:r>
+              <w:t xml:space="preserve">  • C2.2 — Composants d'accès aux données (lecture shifts + user via token URL pour le flux iCal)</w:t>
+            </w:r>
+            <w:r>
+              <w:br/>
+            </w:r>
+            <w:r>
+              <w:t xml:space="preserve">  • C2.3 — Back-end (génération d'un flux RFC 5545 conforme avec VALARM pour notifications natives)</w:t>
+            </w:r>
+            <w:r>
+              <w:br/>
+            </w:r>
+            <w:r>
+              <w:t xml:space="preserve"/>
+            </w:r>
+            <w:r>
+              <w:br/>
+            </w:r>
             <w:r>
               <w:t xml:space="preserve">Pour permettre à chaque équipier de recevoir ses shifts directement dans son application Calendrier native (iPhone Calendar, Google Calendar, Outlook), j'ai implémenté la génération d'un flux iCalendar conforme à la RFC 5545 — pas d'application supplémentaire à installer.</w:t>
             </w:r>

</xml_diff>

<commit_message>
fix(DP): chaque exemple AT démarre en haut de sa propre page
Suppression de remove_excess_page_breaks() : la suppression
systématique des sauts de page entre AT1↔AT2 et entre exemples
laissait des en-têtes orphelins (« Activité-type 2 » coincé en bas
de la page 10 au lieu d'ouvrir la 11). On laisse maintenant chaque
table d'exemple démarrer proprement sur une nouvelle page.

Boundaries finales (30 pages) :
  AT1 ex1 → p6, ex2 → p8, ex3 → p10
  AT2 ex1 → p13, ex2 → p15, ex3 → p17
  Diplômes → p21, Déclaration → p22
  Documents → p23, Annexes → p25
</commit_message>
<xml_diff>
--- a/dossier-professionnel/DP_AFPA_rempli.docx
+++ b/dossier-professionnel/DP_AFPA_rempli.docx
@@ -3126,6 +3126,21 @@
           <w:color w:val="404040" w:themeColor="text1" w:themeTint="BF"/>
         </w:rPr>
       </w:pPr>
+    </w:p>
+    <w:p>
+      <w:pPr>
+        <w:rPr>
+          <w:rFonts w:cstheme="minorHAnsi"/>
+          <w:color w:val="404040" w:themeColor="text1" w:themeTint="BF"/>
+        </w:rPr>
+      </w:pPr>
+      <w:r>
+        <w:rPr>
+          <w:rFonts w:cstheme="minorHAnsi"/>
+          <w:color w:val="404040" w:themeColor="text1" w:themeTint="BF"/>
+        </w:rPr>
+        <w:br w:type="page"/>
+      </w:r>
     </w:p>
     <w:p>
       <w:pPr>
@@ -3236,6 +3251,21 @@
         </w:rPr>
       </w:pPr>
     </w:p>
+    <w:p>
+      <w:pPr>
+        <w:rPr>
+          <w:rFonts w:cstheme="minorHAnsi"/>
+          <w:color w:val="404040" w:themeColor="text1" w:themeTint="BF"/>
+        </w:rPr>
+      </w:pPr>
+      <w:r>
+        <w:rPr>
+          <w:rFonts w:cstheme="minorHAnsi"/>
+          <w:color w:val="404040" w:themeColor="text1" w:themeTint="BF"/>
+        </w:rPr>
+        <w:br w:type="page"/>
+      </w:r>
+    </w:p>
     <w:tbl>
       <w:tblPr>
         <w:tblStyle w:val="Grilledutableau"/>
@@ -7631,6 +7661,11 @@
       </w:tr>
     </w:tbl>
     <w:p/>
+    <w:p>
+      <w:r>
+        <w:br w:type="page"/>
+      </w:r>
+    </w:p>
     <w:p/>
     <w:tbl>
       <w:tblPr>
@@ -12062,6 +12097,11 @@
     </w:p>
     <w:p/>
     <w:p/>
+    <w:p>
+      <w:r>
+        <w:br w:type="page"/>
+      </w:r>
+    </w:p>
     <w:p/>
     <w:p>
       <w:pPr>

</xml_diff>

<commit_message>
fix(DP): retire la ligne de version « 11/09/2017 » des pieds de page
Le template AFPA contient en pied de page la mention « DOSSIER
PROFESSIONNEL-Version Traitement de texte – Version du 11/09/2017 »
qui n'apporte rien au jury et alourdit visuellement chaque page.

Nouvelle fonction strip_footer_version_string() qui vide ces nœuds
texte sans toucher au champ « Page N » (préservé via détection
ciblée des seuls <w:t> contenant le marqueur de version).

Appliqué à toutes les sections × tous les footers (pair / impair /
première page).
</commit_message>
<xml_diff>
--- a/dossier-professionnel/DP_AFPA_rempli.docx
+++ b/dossier-professionnel/DP_AFPA_rempli.docx
@@ -970,6 +970,7 @@
           <w:headerReference w:type="default" r:id="rId10"/>
           <w:footerReference w:type="even" r:id="rId11"/>
           <w:footerReference w:type="default" r:id="rId12"/>
+          <w:footerReference w:type="first" r:id="rId18"/>
           <w:pgSz w:w="11906" w:h="16838" w:code="9"/>
           <w:pgMar w:top="1418" w:right="1418" w:bottom="1418" w:left="1418" w:header="567" w:footer="510" w:gutter="0"/>
           <w:cols w:space="708"/>
@@ -14153,7 +14154,7 @@
                     <pic:cNvPicPr/>
                   </pic:nvPicPr>
                   <pic:blipFill>
-                    <a:blip r:embed="rId18"/>
+                    <a:blip r:embed="rId19"/>
                     <a:stretch>
                       <a:fillRect/>
                     </a:stretch>
@@ -14201,7 +14202,7 @@
                     <pic:cNvPicPr/>
                   </pic:nvPicPr>
                   <pic:blipFill>
-                    <a:blip r:embed="rId19"/>
+                    <a:blip r:embed="rId20"/>
                     <a:stretch>
                       <a:fillRect/>
                     </a:stretch>
@@ -14249,7 +14250,7 @@
                     <pic:cNvPicPr/>
                   </pic:nvPicPr>
                   <pic:blipFill>
-                    <a:blip r:embed="rId20"/>
+                    <a:blip r:embed="rId21"/>
                     <a:stretch>
                       <a:fillRect/>
                     </a:stretch>
@@ -14297,7 +14298,7 @@
                     <pic:cNvPicPr/>
                   </pic:nvPicPr>
                   <pic:blipFill>
-                    <a:blip r:embed="rId21"/>
+                    <a:blip r:embed="rId22"/>
                     <a:stretch>
                       <a:fillRect/>
                     </a:stretch>
@@ -14345,7 +14346,7 @@
                     <pic:cNvPicPr/>
                   </pic:nvPicPr>
                   <pic:blipFill>
-                    <a:blip r:embed="rId22"/>
+                    <a:blip r:embed="rId23"/>
                     <a:stretch>
                       <a:fillRect/>
                     </a:stretch>
@@ -14393,7 +14394,7 @@
                     <pic:cNvPicPr/>
                   </pic:nvPicPr>
                   <pic:blipFill>
-                    <a:blip r:embed="rId23"/>
+                    <a:blip r:embed="rId24"/>
                     <a:stretch>
                       <a:fillRect/>
                     </a:stretch>
@@ -14670,7 +14671,7 @@
         <w:sz w:val="18"/>
         <w:szCs w:val="18"/>
       </w:rPr>
-      <w:t>DOSSIER PROFESSIONNEL-Version du 11/09/2017</w:t>
+      <w:t/>
     </w:r>
     <w:r>
       <w:rPr>
@@ -14859,7 +14860,7 @@
         <w:sz w:val="18"/>
         <w:szCs w:val="18"/>
       </w:rPr>
-      <w:t xml:space="preserve">DOSSIER PROFESSIONNEL-Version </w:t>
+      <w:t xml:space="preserve"/>
     </w:r>
     <w:r>
       <w:rPr>
@@ -14867,7 +14868,7 @@
         <w:sz w:val="18"/>
         <w:szCs w:val="18"/>
       </w:rPr>
-      <w:t>Traitement de texte – Version du 11/09/2017</w:t>
+      <w:t/>
     </w:r>
     <w:r>
       <w:rPr>
@@ -14949,6 +14950,16 @@
   <w:p>
     <w:pPr>
       <w:pStyle w:val="Pieddepage"/>
+    </w:pPr>
+  </w:p>
+</w:ftr>
+</file>
+
+<file path=word/footer3.xml><?xml version="1.0" encoding="utf-8"?>
+<w:ftr xmlns:m="http://schemas.openxmlformats.org/officeDocument/2006/math" xmlns:mc="http://schemas.openxmlformats.org/markup-compatibility/2006" xmlns:mo="http://schemas.microsoft.com/office/mac/office/2008/main" xmlns:mv="urn:schemas-microsoft-com:mac:vml" xmlns:o="urn:schemas-microsoft-com:office:office" xmlns:r="http://schemas.openxmlformats.org/officeDocument/2006/relationships" xmlns:v="urn:schemas-microsoft-com:vml" xmlns:w10="urn:schemas-microsoft-com:office:word" xmlns:w14="http://schemas.microsoft.com/office/word/2010/wordml" xmlns:w="http://schemas.openxmlformats.org/wordprocessingml/2006/main" xmlns:wne="http://schemas.microsoft.com/office/word/2006/wordml" xmlns:wp14="http://schemas.microsoft.com/office/word/2010/wordprocessingDrawing" xmlns:wp="http://schemas.openxmlformats.org/drawingml/2006/wordprocessingDrawing" xmlns:wpc="http://schemas.microsoft.com/office/word/2010/wordprocessingCanvas" xmlns:wpg="http://schemas.microsoft.com/office/word/2010/wordprocessingGroup" xmlns:wpi="http://schemas.microsoft.com/office/word/2010/wordprocessingInk" xmlns:wps="http://schemas.microsoft.com/office/word/2010/wordprocessingShape" mc:Ignorable="w14 wp14">
+  <w:p>
+    <w:pPr>
+      <w:pStyle w:val="Footer"/>
     </w:pPr>
   </w:p>
 </w:ftr>

</xml_diff>